<commit_message>
they cant stop me AHHH
</commit_message>
<xml_diff>
--- a/Documentation/Design/CMSC4900Group2 - Design Paper.docx
+++ b/Documentation/Design/CMSC4900Group2 - Design Paper.docx
@@ -7908,7 +7908,6 @@
                 <w:rFonts w:ascii="Times New Roman" w:hAnsi="Times New Roman" w:cs="Times New Roman"/>
               </w:rPr>
             </w:pPr>
-            <w:proofErr w:type="spellStart"/>
             <w:proofErr w:type="gramStart"/>
             <w:r>
               <w:rPr>
@@ -7916,7 +7915,6 @@
               </w:rPr>
               <w:t>GroupName</w:t>
             </w:r>
-            <w:proofErr w:type="spellEnd"/>
             <w:r>
               <w:rPr>
                 <w:rFonts w:ascii="Times New Roman" w:hAnsi="Times New Roman" w:cs="Times New Roman"/>
@@ -8260,19 +8258,11 @@
                 <w:rFonts w:ascii="Times New Roman" w:hAnsi="Times New Roman" w:cs="Times New Roman"/>
               </w:rPr>
             </w:pPr>
-            <w:proofErr w:type="spellStart"/>
-            <w:r>
-              <w:rPr>
-                <w:rFonts w:ascii="Times New Roman" w:hAnsi="Times New Roman" w:cs="Times New Roman"/>
-              </w:rPr>
-              <w:t>GroupName</w:t>
-            </w:r>
-            <w:proofErr w:type="spellEnd"/>
-            <w:r>
-              <w:rPr>
-                <w:rFonts w:ascii="Times New Roman" w:hAnsi="Times New Roman" w:cs="Times New Roman"/>
-              </w:rPr>
-              <w:t xml:space="preserve"> data member must be filled in</w:t>
+            <w:r>
+              <w:rPr>
+                <w:rFonts w:ascii="Times New Roman" w:hAnsi="Times New Roman" w:cs="Times New Roman"/>
+              </w:rPr>
+              <w:t>GroupName data member must be filled in</w:t>
             </w:r>
           </w:p>
         </w:tc>
@@ -9703,7 +9693,6 @@
         </w:rPr>
         <w:t xml:space="preserve">There will be </w:t>
       </w:r>
-      <w:proofErr w:type="spellStart"/>
       <w:proofErr w:type="gramStart"/>
       <w:r>
         <w:rPr>
@@ -9711,7 +9700,6 @@
         </w:rPr>
         <w:t>a</w:t>
       </w:r>
-      <w:proofErr w:type="spellEnd"/>
       <w:proofErr w:type="gramEnd"/>
       <w:r>
         <w:rPr>

</xml_diff>

<commit_message>
almost finishe user manual
</commit_message>
<xml_diff>
--- a/Documentation/Design/CMSC4900Group2 - Design Paper.docx
+++ b/Documentation/Design/CMSC4900Group2 - Design Paper.docx
@@ -6234,19 +6234,11 @@
                 <w:rFonts w:ascii="Times New Roman" w:hAnsi="Times New Roman" w:cs="Times New Roman"/>
               </w:rPr>
             </w:pPr>
-            <w:proofErr w:type="gramStart"/>
-            <w:r>
-              <w:rPr>
-                <w:rFonts w:ascii="Times New Roman" w:hAnsi="Times New Roman" w:cs="Times New Roman"/>
-              </w:rPr>
-              <w:t>FirstName :</w:t>
-            </w:r>
-            <w:proofErr w:type="gramEnd"/>
-            <w:r>
-              <w:rPr>
-                <w:rFonts w:ascii="Times New Roman" w:hAnsi="Times New Roman" w:cs="Times New Roman"/>
-              </w:rPr>
-              <w:t xml:space="preserve"> </w:t>
+            <w:r>
+              <w:rPr>
+                <w:rFonts w:ascii="Times New Roman" w:hAnsi="Times New Roman" w:cs="Times New Roman"/>
+              </w:rPr>
+              <w:t xml:space="preserve">FirstName : </w:t>
             </w:r>
             <w:r>
               <w:rPr>
@@ -6262,19 +6254,11 @@
                 <w:rFonts w:ascii="Times New Roman" w:hAnsi="Times New Roman" w:cs="Times New Roman"/>
               </w:rPr>
             </w:pPr>
-            <w:proofErr w:type="gramStart"/>
-            <w:r>
-              <w:rPr>
-                <w:rFonts w:ascii="Times New Roman" w:hAnsi="Times New Roman" w:cs="Times New Roman"/>
-              </w:rPr>
-              <w:t>LastName :</w:t>
-            </w:r>
-            <w:proofErr w:type="gramEnd"/>
-            <w:r>
-              <w:rPr>
-                <w:rFonts w:ascii="Times New Roman" w:hAnsi="Times New Roman" w:cs="Times New Roman"/>
-              </w:rPr>
-              <w:t xml:space="preserve"> string</w:t>
+            <w:r>
+              <w:rPr>
+                <w:rFonts w:ascii="Times New Roman" w:hAnsi="Times New Roman" w:cs="Times New Roman"/>
+              </w:rPr>
+              <w:t>LastName : string</w:t>
             </w:r>
           </w:p>
           <w:p>
@@ -6284,19 +6268,11 @@
                 <w:rFonts w:ascii="Times New Roman" w:hAnsi="Times New Roman" w:cs="Times New Roman"/>
               </w:rPr>
             </w:pPr>
-            <w:proofErr w:type="gramStart"/>
-            <w:r>
-              <w:rPr>
-                <w:rFonts w:ascii="Times New Roman" w:hAnsi="Times New Roman" w:cs="Times New Roman"/>
-              </w:rPr>
-              <w:t>UserID :</w:t>
-            </w:r>
-            <w:proofErr w:type="gramEnd"/>
-            <w:r>
-              <w:rPr>
-                <w:rFonts w:ascii="Times New Roman" w:hAnsi="Times New Roman" w:cs="Times New Roman"/>
-              </w:rPr>
-              <w:t xml:space="preserve"> int</w:t>
+            <w:r>
+              <w:rPr>
+                <w:rFonts w:ascii="Times New Roman" w:hAnsi="Times New Roman" w:cs="Times New Roman"/>
+              </w:rPr>
+              <w:t>UserID : int</w:t>
             </w:r>
           </w:p>
           <w:p>
@@ -6306,19 +6282,11 @@
                 <w:rFonts w:ascii="Times New Roman" w:hAnsi="Times New Roman" w:cs="Times New Roman"/>
               </w:rPr>
             </w:pPr>
-            <w:proofErr w:type="gramStart"/>
-            <w:r>
-              <w:rPr>
-                <w:rFonts w:ascii="Times New Roman" w:hAnsi="Times New Roman" w:cs="Times New Roman"/>
-              </w:rPr>
-              <w:t>Email :</w:t>
-            </w:r>
-            <w:proofErr w:type="gramEnd"/>
-            <w:r>
-              <w:rPr>
-                <w:rFonts w:ascii="Times New Roman" w:hAnsi="Times New Roman" w:cs="Times New Roman"/>
-              </w:rPr>
-              <w:t xml:space="preserve"> string</w:t>
+            <w:r>
+              <w:rPr>
+                <w:rFonts w:ascii="Times New Roman" w:hAnsi="Times New Roman" w:cs="Times New Roman"/>
+              </w:rPr>
+              <w:t>Email : string</w:t>
             </w:r>
           </w:p>
           <w:p>
@@ -6328,19 +6296,11 @@
                 <w:rFonts w:ascii="Times New Roman" w:hAnsi="Times New Roman" w:cs="Times New Roman"/>
               </w:rPr>
             </w:pPr>
-            <w:proofErr w:type="gramStart"/>
-            <w:r>
-              <w:rPr>
-                <w:rFonts w:ascii="Times New Roman" w:hAnsi="Times New Roman" w:cs="Times New Roman"/>
-              </w:rPr>
-              <w:t>Password :</w:t>
-            </w:r>
-            <w:proofErr w:type="gramEnd"/>
-            <w:r>
-              <w:rPr>
-                <w:rFonts w:ascii="Times New Roman" w:hAnsi="Times New Roman" w:cs="Times New Roman"/>
-              </w:rPr>
-              <w:t xml:space="preserve"> string</w:t>
+            <w:r>
+              <w:rPr>
+                <w:rFonts w:ascii="Times New Roman" w:hAnsi="Times New Roman" w:cs="Times New Roman"/>
+              </w:rPr>
+              <w:t>Password : string</w:t>
             </w:r>
           </w:p>
           <w:p>
@@ -6350,19 +6310,11 @@
                 <w:rFonts w:ascii="Times New Roman" w:hAnsi="Times New Roman" w:cs="Times New Roman"/>
               </w:rPr>
             </w:pPr>
-            <w:proofErr w:type="gramStart"/>
-            <w:r>
-              <w:rPr>
-                <w:rFonts w:ascii="Times New Roman" w:hAnsi="Times New Roman" w:cs="Times New Roman"/>
-              </w:rPr>
-              <w:t>Groups :</w:t>
-            </w:r>
-            <w:proofErr w:type="gramEnd"/>
-            <w:r>
-              <w:rPr>
-                <w:rFonts w:ascii="Times New Roman" w:hAnsi="Times New Roman" w:cs="Times New Roman"/>
-              </w:rPr>
-              <w:t xml:space="preserve"> list&lt;Groups&gt;</w:t>
+            <w:r>
+              <w:rPr>
+                <w:rFonts w:ascii="Times New Roman" w:hAnsi="Times New Roman" w:cs="Times New Roman"/>
+              </w:rPr>
+              <w:t>Groups : list&lt;Groups&gt;</w:t>
             </w:r>
           </w:p>
         </w:tc>
@@ -6403,7 +6355,6 @@
                 <w:rFonts w:ascii="Times New Roman" w:hAnsi="Times New Roman" w:cs="Times New Roman"/>
               </w:rPr>
             </w:pPr>
-            <w:proofErr w:type="gramStart"/>
             <w:r>
               <w:rPr>
                 <w:rFonts w:ascii="Times New Roman" w:hAnsi="Times New Roman" w:cs="Times New Roman"/>
@@ -6414,14 +6365,7 @@
               <w:rPr>
                 <w:rFonts w:ascii="Times New Roman" w:hAnsi="Times New Roman" w:cs="Times New Roman"/>
               </w:rPr>
-              <w:t>alidateLogin(</w:t>
-            </w:r>
-            <w:proofErr w:type="gramEnd"/>
-            <w:r>
-              <w:rPr>
-                <w:rFonts w:ascii="Times New Roman" w:hAnsi="Times New Roman" w:cs="Times New Roman"/>
-              </w:rPr>
-              <w:t>)</w:t>
+              <w:t>alidateLogin()</w:t>
             </w:r>
           </w:p>
           <w:p>
@@ -6431,7 +6375,6 @@
                 <w:rFonts w:ascii="Times New Roman" w:hAnsi="Times New Roman" w:cs="Times New Roman"/>
               </w:rPr>
             </w:pPr>
-            <w:proofErr w:type="gramStart"/>
             <w:r>
               <w:rPr>
                 <w:rFonts w:ascii="Times New Roman" w:hAnsi="Times New Roman" w:cs="Times New Roman"/>
@@ -6442,14 +6385,7 @@
               <w:rPr>
                 <w:rFonts w:ascii="Times New Roman" w:hAnsi="Times New Roman" w:cs="Times New Roman"/>
               </w:rPr>
-              <w:t>pdateProfile(</w:t>
-            </w:r>
-            <w:proofErr w:type="gramEnd"/>
-            <w:r>
-              <w:rPr>
-                <w:rFonts w:ascii="Times New Roman" w:hAnsi="Times New Roman" w:cs="Times New Roman"/>
-              </w:rPr>
-              <w:t>)</w:t>
+              <w:t>pdateProfile()</w:t>
             </w:r>
           </w:p>
           <w:p>
@@ -6459,19 +6395,11 @@
                 <w:rFonts w:ascii="Times New Roman" w:hAnsi="Times New Roman" w:cs="Times New Roman"/>
               </w:rPr>
             </w:pPr>
-            <w:proofErr w:type="gramStart"/>
-            <w:r>
-              <w:rPr>
-                <w:rFonts w:ascii="Times New Roman" w:hAnsi="Times New Roman" w:cs="Times New Roman"/>
-              </w:rPr>
-              <w:t>JoinGroup(</w:t>
-            </w:r>
-            <w:proofErr w:type="gramEnd"/>
-            <w:r>
-              <w:rPr>
-                <w:rFonts w:ascii="Times New Roman" w:hAnsi="Times New Roman" w:cs="Times New Roman"/>
-              </w:rPr>
-              <w:t>)</w:t>
+            <w:r>
+              <w:rPr>
+                <w:rFonts w:ascii="Times New Roman" w:hAnsi="Times New Roman" w:cs="Times New Roman"/>
+              </w:rPr>
+              <w:t>JoinGroup()</w:t>
             </w:r>
           </w:p>
           <w:p>
@@ -6481,19 +6409,11 @@
                 <w:rFonts w:ascii="Times New Roman" w:hAnsi="Times New Roman" w:cs="Times New Roman"/>
               </w:rPr>
             </w:pPr>
-            <w:proofErr w:type="gramStart"/>
-            <w:r>
-              <w:rPr>
-                <w:rFonts w:ascii="Times New Roman" w:hAnsi="Times New Roman" w:cs="Times New Roman"/>
-              </w:rPr>
-              <w:t>ViewActivities(</w:t>
-            </w:r>
-            <w:proofErr w:type="gramEnd"/>
-            <w:r>
-              <w:rPr>
-                <w:rFonts w:ascii="Times New Roman" w:hAnsi="Times New Roman" w:cs="Times New Roman"/>
-              </w:rPr>
-              <w:t>)</w:t>
+            <w:r>
+              <w:rPr>
+                <w:rFonts w:ascii="Times New Roman" w:hAnsi="Times New Roman" w:cs="Times New Roman"/>
+              </w:rPr>
+              <w:t>ViewActivities()</w:t>
             </w:r>
           </w:p>
         </w:tc>
@@ -6783,19 +6703,11 @@
           <w:rFonts w:ascii="Times New Roman" w:hAnsi="Times New Roman" w:cs="Times New Roman"/>
         </w:rPr>
       </w:pPr>
-      <w:proofErr w:type="gramStart"/>
-      <w:r>
-        <w:rPr>
-          <w:rFonts w:ascii="Times New Roman" w:hAnsi="Times New Roman" w:cs="Times New Roman"/>
-        </w:rPr>
-        <w:t>ValidateLogin(</w:t>
-      </w:r>
-      <w:proofErr w:type="gramEnd"/>
-      <w:r>
-        <w:rPr>
-          <w:rFonts w:ascii="Times New Roman" w:hAnsi="Times New Roman" w:cs="Times New Roman"/>
-        </w:rPr>
-        <w:t xml:space="preserve">) </w:t>
+      <w:r>
+        <w:rPr>
+          <w:rFonts w:ascii="Times New Roman" w:hAnsi="Times New Roman" w:cs="Times New Roman"/>
+        </w:rPr>
+        <w:t xml:space="preserve">ValidateLogin() </w:t>
       </w:r>
       <w:r>
         <w:rPr>
@@ -6816,19 +6728,11 @@
           <w:rFonts w:ascii="Times New Roman" w:hAnsi="Times New Roman" w:cs="Times New Roman"/>
         </w:rPr>
       </w:pPr>
-      <w:proofErr w:type="gramStart"/>
-      <w:r>
-        <w:rPr>
-          <w:rFonts w:ascii="Times New Roman" w:hAnsi="Times New Roman" w:cs="Times New Roman"/>
-        </w:rPr>
-        <w:t>UpdateProfile(</w:t>
-      </w:r>
-      <w:proofErr w:type="gramEnd"/>
-      <w:r>
-        <w:rPr>
-          <w:rFonts w:ascii="Times New Roman" w:hAnsi="Times New Roman" w:cs="Times New Roman"/>
-        </w:rPr>
-        <w:t>)</w:t>
+      <w:r>
+        <w:rPr>
+          <w:rFonts w:ascii="Times New Roman" w:hAnsi="Times New Roman" w:cs="Times New Roman"/>
+        </w:rPr>
+        <w:t>UpdateProfile()</w:t>
       </w:r>
       <w:r>
         <w:rPr>
@@ -6849,19 +6753,11 @@
           <w:rFonts w:ascii="Times New Roman" w:hAnsi="Times New Roman" w:cs="Times New Roman"/>
         </w:rPr>
       </w:pPr>
-      <w:proofErr w:type="gramStart"/>
-      <w:r>
-        <w:rPr>
-          <w:rFonts w:ascii="Times New Roman" w:hAnsi="Times New Roman" w:cs="Times New Roman"/>
-        </w:rPr>
-        <w:t>JoinGroup(</w:t>
-      </w:r>
-      <w:proofErr w:type="gramEnd"/>
-      <w:r>
-        <w:rPr>
-          <w:rFonts w:ascii="Times New Roman" w:hAnsi="Times New Roman" w:cs="Times New Roman"/>
-        </w:rPr>
-        <w:t>)</w:t>
+      <w:r>
+        <w:rPr>
+          <w:rFonts w:ascii="Times New Roman" w:hAnsi="Times New Roman" w:cs="Times New Roman"/>
+        </w:rPr>
+        <w:t>JoinGroup()</w:t>
       </w:r>
       <w:r>
         <w:rPr>
@@ -6888,19 +6784,11 @@
           <w:rFonts w:ascii="Times New Roman" w:hAnsi="Times New Roman" w:cs="Times New Roman"/>
         </w:rPr>
       </w:pPr>
-      <w:proofErr w:type="gramStart"/>
-      <w:r>
-        <w:rPr>
-          <w:rFonts w:ascii="Times New Roman" w:hAnsi="Times New Roman" w:cs="Times New Roman"/>
-        </w:rPr>
-        <w:t>ViewActivities(</w:t>
-      </w:r>
-      <w:proofErr w:type="gramEnd"/>
-      <w:r>
-        <w:rPr>
-          <w:rFonts w:ascii="Times New Roman" w:hAnsi="Times New Roman" w:cs="Times New Roman"/>
-        </w:rPr>
-        <w:t>)</w:t>
+      <w:r>
+        <w:rPr>
+          <w:rFonts w:ascii="Times New Roman" w:hAnsi="Times New Roman" w:cs="Times New Roman"/>
+        </w:rPr>
+        <w:t>ViewActivities()</w:t>
       </w:r>
       <w:r>
         <w:rPr>
@@ -7019,7 +6907,6 @@
               </w:rPr>
             </w:pPr>
             <w:proofErr w:type="spellStart"/>
-            <w:proofErr w:type="gramStart"/>
             <w:r>
               <w:rPr>
                 <w:rFonts w:ascii="Times New Roman" w:hAnsi="Times New Roman" w:cs="Times New Roman"/>
@@ -7031,14 +6918,7 @@
               <w:rPr>
                 <w:rFonts w:ascii="Times New Roman" w:hAnsi="Times New Roman" w:cs="Times New Roman"/>
               </w:rPr>
-              <w:t xml:space="preserve"> :</w:t>
-            </w:r>
-            <w:proofErr w:type="gramEnd"/>
-            <w:r>
-              <w:rPr>
-                <w:rFonts w:ascii="Times New Roman" w:hAnsi="Times New Roman" w:cs="Times New Roman"/>
-              </w:rPr>
-              <w:t xml:space="preserve"> int</w:t>
+              <w:t xml:space="preserve"> : int</w:t>
             </w:r>
           </w:p>
           <w:p>
@@ -7048,7 +6928,6 @@
                 <w:rFonts w:ascii="Times New Roman" w:hAnsi="Times New Roman" w:cs="Times New Roman"/>
               </w:rPr>
             </w:pPr>
-            <w:proofErr w:type="gramStart"/>
             <w:r>
               <w:rPr>
                 <w:rFonts w:ascii="Times New Roman" w:hAnsi="Times New Roman" w:cs="Times New Roman"/>
@@ -7059,14 +6938,7 @@
               <w:rPr>
                 <w:rFonts w:ascii="Times New Roman" w:hAnsi="Times New Roman" w:cs="Times New Roman"/>
               </w:rPr>
-              <w:t xml:space="preserve"> :</w:t>
-            </w:r>
-            <w:proofErr w:type="gramEnd"/>
-            <w:r>
-              <w:rPr>
-                <w:rFonts w:ascii="Times New Roman" w:hAnsi="Times New Roman" w:cs="Times New Roman"/>
-              </w:rPr>
-              <w:t xml:space="preserve"> int</w:t>
+              <w:t xml:space="preserve"> : int</w:t>
             </w:r>
           </w:p>
           <w:p>
@@ -7077,7 +6949,6 @@
               </w:rPr>
             </w:pPr>
             <w:proofErr w:type="spellStart"/>
-            <w:proofErr w:type="gramStart"/>
             <w:r>
               <w:rPr>
                 <w:rFonts w:ascii="Times New Roman" w:hAnsi="Times New Roman" w:cs="Times New Roman"/>
@@ -7089,14 +6960,7 @@
               <w:rPr>
                 <w:rFonts w:ascii="Times New Roman" w:hAnsi="Times New Roman" w:cs="Times New Roman"/>
               </w:rPr>
-              <w:t xml:space="preserve"> :</w:t>
-            </w:r>
-            <w:proofErr w:type="gramEnd"/>
-            <w:r>
-              <w:rPr>
-                <w:rFonts w:ascii="Times New Roman" w:hAnsi="Times New Roman" w:cs="Times New Roman"/>
-              </w:rPr>
-              <w:t xml:space="preserve"> string</w:t>
+              <w:t xml:space="preserve"> : string</w:t>
             </w:r>
           </w:p>
           <w:p>
@@ -7106,7 +6970,6 @@
                 <w:rFonts w:ascii="Times New Roman" w:hAnsi="Times New Roman" w:cs="Times New Roman"/>
               </w:rPr>
             </w:pPr>
-            <w:proofErr w:type="gramStart"/>
             <w:r>
               <w:rPr>
                 <w:rFonts w:ascii="Times New Roman" w:hAnsi="Times New Roman" w:cs="Times New Roman"/>
@@ -7117,14 +6980,7 @@
               <w:rPr>
                 <w:rFonts w:ascii="Times New Roman" w:hAnsi="Times New Roman" w:cs="Times New Roman"/>
               </w:rPr>
-              <w:t xml:space="preserve"> :</w:t>
-            </w:r>
-            <w:proofErr w:type="gramEnd"/>
-            <w:r>
-              <w:rPr>
-                <w:rFonts w:ascii="Times New Roman" w:hAnsi="Times New Roman" w:cs="Times New Roman"/>
-              </w:rPr>
-              <w:t xml:space="preserve"> float</w:t>
+              <w:t xml:space="preserve"> : float</w:t>
             </w:r>
           </w:p>
           <w:p>
@@ -7134,7 +6990,6 @@
                 <w:rFonts w:ascii="Times New Roman" w:hAnsi="Times New Roman" w:cs="Times New Roman"/>
               </w:rPr>
             </w:pPr>
-            <w:proofErr w:type="gramStart"/>
             <w:r>
               <w:rPr>
                 <w:rFonts w:ascii="Times New Roman" w:hAnsi="Times New Roman" w:cs="Times New Roman"/>
@@ -7145,14 +7000,7 @@
               <w:rPr>
                 <w:rFonts w:ascii="Times New Roman" w:hAnsi="Times New Roman" w:cs="Times New Roman"/>
               </w:rPr>
-              <w:t xml:space="preserve"> :</w:t>
-            </w:r>
-            <w:proofErr w:type="gramEnd"/>
-            <w:r>
-              <w:rPr>
-                <w:rFonts w:ascii="Times New Roman" w:hAnsi="Times New Roman" w:cs="Times New Roman"/>
-              </w:rPr>
-              <w:t xml:space="preserve"> float</w:t>
+              <w:t xml:space="preserve"> : float</w:t>
             </w:r>
           </w:p>
           <w:p>
@@ -7162,7 +7010,6 @@
                 <w:rFonts w:ascii="Times New Roman" w:hAnsi="Times New Roman" w:cs="Times New Roman"/>
               </w:rPr>
             </w:pPr>
-            <w:proofErr w:type="gramStart"/>
             <w:r>
               <w:rPr>
                 <w:rFonts w:ascii="Times New Roman" w:hAnsi="Times New Roman" w:cs="Times New Roman"/>
@@ -7173,14 +7020,7 @@
               <w:rPr>
                 <w:rFonts w:ascii="Times New Roman" w:hAnsi="Times New Roman" w:cs="Times New Roman"/>
               </w:rPr>
-              <w:t xml:space="preserve"> :</w:t>
-            </w:r>
-            <w:proofErr w:type="gramEnd"/>
-            <w:r>
-              <w:rPr>
-                <w:rFonts w:ascii="Times New Roman" w:hAnsi="Times New Roman" w:cs="Times New Roman"/>
-              </w:rPr>
-              <w:t xml:space="preserve"> date</w:t>
+              <w:t xml:space="preserve"> : date</w:t>
             </w:r>
           </w:p>
           <w:p>
@@ -7191,7 +7031,6 @@
               </w:rPr>
             </w:pPr>
             <w:proofErr w:type="spellStart"/>
-            <w:proofErr w:type="gramStart"/>
             <w:r>
               <w:rPr>
                 <w:rFonts w:ascii="Times New Roman" w:hAnsi="Times New Roman" w:cs="Times New Roman"/>
@@ -7203,14 +7042,7 @@
               <w:rPr>
                 <w:rFonts w:ascii="Times New Roman" w:hAnsi="Times New Roman" w:cs="Times New Roman"/>
               </w:rPr>
-              <w:t xml:space="preserve"> :</w:t>
-            </w:r>
-            <w:proofErr w:type="gramEnd"/>
-            <w:r>
-              <w:rPr>
-                <w:rFonts w:ascii="Times New Roman" w:hAnsi="Times New Roman" w:cs="Times New Roman"/>
-              </w:rPr>
-              <w:t xml:space="preserve"> string</w:t>
+              <w:t xml:space="preserve"> : string</w:t>
             </w:r>
           </w:p>
           <w:p>
@@ -7220,19 +7052,11 @@
                 <w:rFonts w:ascii="Times New Roman" w:hAnsi="Times New Roman" w:cs="Times New Roman"/>
               </w:rPr>
             </w:pPr>
-            <w:proofErr w:type="gramStart"/>
-            <w:r>
-              <w:rPr>
-                <w:rFonts w:ascii="Times New Roman" w:hAnsi="Times New Roman" w:cs="Times New Roman"/>
-              </w:rPr>
-              <w:t>Pace :</w:t>
-            </w:r>
-            <w:proofErr w:type="gramEnd"/>
-            <w:r>
-              <w:rPr>
-                <w:rFonts w:ascii="Times New Roman" w:hAnsi="Times New Roman" w:cs="Times New Roman"/>
-              </w:rPr>
-              <w:t xml:space="preserve"> float</w:t>
+            <w:r>
+              <w:rPr>
+                <w:rFonts w:ascii="Times New Roman" w:hAnsi="Times New Roman" w:cs="Times New Roman"/>
+              </w:rPr>
+              <w:t>Pace : float</w:t>
             </w:r>
           </w:p>
         </w:tc>
@@ -7273,19 +7097,11 @@
                 <w:rFonts w:ascii="Times New Roman" w:hAnsi="Times New Roman" w:cs="Times New Roman"/>
               </w:rPr>
             </w:pPr>
-            <w:proofErr w:type="gramStart"/>
-            <w:r>
-              <w:rPr>
-                <w:rFonts w:ascii="Times New Roman" w:hAnsi="Times New Roman" w:cs="Times New Roman"/>
-              </w:rPr>
-              <w:t>CreateActivity(</w:t>
-            </w:r>
-            <w:proofErr w:type="gramEnd"/>
-            <w:r>
-              <w:rPr>
-                <w:rFonts w:ascii="Times New Roman" w:hAnsi="Times New Roman" w:cs="Times New Roman"/>
-              </w:rPr>
-              <w:t>)</w:t>
+            <w:r>
+              <w:rPr>
+                <w:rFonts w:ascii="Times New Roman" w:hAnsi="Times New Roman" w:cs="Times New Roman"/>
+              </w:rPr>
+              <w:t>CreateActivity()</w:t>
             </w:r>
           </w:p>
           <w:p>
@@ -7295,19 +7111,11 @@
                 <w:rFonts w:ascii="Times New Roman" w:hAnsi="Times New Roman" w:cs="Times New Roman"/>
               </w:rPr>
             </w:pPr>
-            <w:proofErr w:type="gramStart"/>
-            <w:r>
-              <w:rPr>
-                <w:rFonts w:ascii="Times New Roman" w:hAnsi="Times New Roman" w:cs="Times New Roman"/>
-              </w:rPr>
-              <w:t>DeleteActivity(</w:t>
-            </w:r>
-            <w:proofErr w:type="gramEnd"/>
-            <w:r>
-              <w:rPr>
-                <w:rFonts w:ascii="Times New Roman" w:hAnsi="Times New Roman" w:cs="Times New Roman"/>
-              </w:rPr>
-              <w:t>)</w:t>
+            <w:r>
+              <w:rPr>
+                <w:rFonts w:ascii="Times New Roman" w:hAnsi="Times New Roman" w:cs="Times New Roman"/>
+              </w:rPr>
+              <w:t>DeleteActivity()</w:t>
             </w:r>
           </w:p>
           <w:p>
@@ -7318,7 +7126,6 @@
               </w:rPr>
             </w:pPr>
             <w:proofErr w:type="spellStart"/>
-            <w:proofErr w:type="gramStart"/>
             <w:r>
               <w:rPr>
                 <w:rFonts w:ascii="Times New Roman" w:hAnsi="Times New Roman" w:cs="Times New Roman"/>
@@ -7330,14 +7137,7 @@
               <w:rPr>
                 <w:rFonts w:ascii="Times New Roman" w:hAnsi="Times New Roman" w:cs="Times New Roman"/>
               </w:rPr>
-              <w:t>(</w:t>
-            </w:r>
-            <w:proofErr w:type="gramEnd"/>
-            <w:r>
-              <w:rPr>
-                <w:rFonts w:ascii="Times New Roman" w:hAnsi="Times New Roman" w:cs="Times New Roman"/>
-              </w:rPr>
-              <w:t>)</w:t>
+              <w:t>()</w:t>
             </w:r>
           </w:p>
           <w:p>
@@ -7347,19 +7147,11 @@
                 <w:rFonts w:ascii="Times New Roman" w:hAnsi="Times New Roman" w:cs="Times New Roman"/>
               </w:rPr>
             </w:pPr>
-            <w:proofErr w:type="gramStart"/>
-            <w:r>
-              <w:rPr>
-                <w:rFonts w:ascii="Times New Roman" w:hAnsi="Times New Roman" w:cs="Times New Roman"/>
-              </w:rPr>
-              <w:t>GetActivity(</w:t>
-            </w:r>
-            <w:proofErr w:type="gramEnd"/>
-            <w:r>
-              <w:rPr>
-                <w:rFonts w:ascii="Times New Roman" w:hAnsi="Times New Roman" w:cs="Times New Roman"/>
-              </w:rPr>
-              <w:t>)</w:t>
+            <w:r>
+              <w:rPr>
+                <w:rFonts w:ascii="Times New Roman" w:hAnsi="Times New Roman" w:cs="Times New Roman"/>
+              </w:rPr>
+              <w:t>GetActivity()</w:t>
             </w:r>
           </w:p>
         </w:tc>
@@ -7565,7 +7357,35 @@
               <w:rPr>
                 <w:rFonts w:ascii="Times New Roman" w:hAnsi="Times New Roman" w:cs="Times New Roman"/>
               </w:rPr>
-              <w:t xml:space="preserve"> activity button is pushed an activity object will be created giving the object a unique activity ID and storing the ID of the user creating the activity. Once created, the activity will ask for the input of activity type, distance, duration, date, route name (Optional), and Pace (Optional). Once all the needed data is added to the activity it will be stored in the database.</w:t>
+              <w:t xml:space="preserve"> activity button is pushed an activity object will be </w:t>
+            </w:r>
+            <w:proofErr w:type="gramStart"/>
+            <w:r>
+              <w:rPr>
+                <w:rFonts w:ascii="Times New Roman" w:hAnsi="Times New Roman" w:cs="Times New Roman"/>
+              </w:rPr>
+              <w:t>created</w:t>
+            </w:r>
+            <w:proofErr w:type="gramEnd"/>
+            <w:r>
+              <w:rPr>
+                <w:rFonts w:ascii="Times New Roman" w:hAnsi="Times New Roman" w:cs="Times New Roman"/>
+              </w:rPr>
+              <w:t xml:space="preserve"> giving the object a unique activity ID and storing the ID of the user </w:t>
+            </w:r>
+            <w:proofErr w:type="gramStart"/>
+            <w:r>
+              <w:rPr>
+                <w:rFonts w:ascii="Times New Roman" w:hAnsi="Times New Roman" w:cs="Times New Roman"/>
+              </w:rPr>
+              <w:t>creating</w:t>
+            </w:r>
+            <w:proofErr w:type="gramEnd"/>
+            <w:r>
+              <w:rPr>
+                <w:rFonts w:ascii="Times New Roman" w:hAnsi="Times New Roman" w:cs="Times New Roman"/>
+              </w:rPr>
+              <w:t xml:space="preserve"> the activity. Once created, the activity will ask for the input of activity type, distance, duration, date, route name (Optional), and Pace (Optional). Once all the needed data is added to the activity it will be stored in the database.</w:t>
             </w:r>
           </w:p>
         </w:tc>
@@ -7621,19 +7441,11 @@
           <w:rFonts w:ascii="Times New Roman" w:hAnsi="Times New Roman" w:cs="Times New Roman"/>
         </w:rPr>
       </w:pPr>
-      <w:proofErr w:type="gramStart"/>
-      <w:r>
-        <w:rPr>
-          <w:rFonts w:ascii="Times New Roman" w:hAnsi="Times New Roman" w:cs="Times New Roman"/>
-        </w:rPr>
-        <w:t>CreateActivity(</w:t>
-      </w:r>
-      <w:proofErr w:type="gramEnd"/>
-      <w:r>
-        <w:rPr>
-          <w:rFonts w:ascii="Times New Roman" w:hAnsi="Times New Roman" w:cs="Times New Roman"/>
-        </w:rPr>
-        <w:t>) – Adds a new activity to the database</w:t>
+      <w:r>
+        <w:rPr>
+          <w:rFonts w:ascii="Times New Roman" w:hAnsi="Times New Roman" w:cs="Times New Roman"/>
+        </w:rPr>
+        <w:t>CreateActivity() – Adds a new activity to the database</w:t>
       </w:r>
     </w:p>
     <w:p>
@@ -7648,19 +7460,11 @@
           <w:rFonts w:ascii="Times New Roman" w:hAnsi="Times New Roman" w:cs="Times New Roman"/>
         </w:rPr>
       </w:pPr>
-      <w:proofErr w:type="gramStart"/>
-      <w:r>
-        <w:rPr>
-          <w:rFonts w:ascii="Times New Roman" w:hAnsi="Times New Roman" w:cs="Times New Roman"/>
-        </w:rPr>
-        <w:t>DeleteActivity(</w:t>
-      </w:r>
-      <w:proofErr w:type="gramEnd"/>
-      <w:r>
-        <w:rPr>
-          <w:rFonts w:ascii="Times New Roman" w:hAnsi="Times New Roman" w:cs="Times New Roman"/>
-        </w:rPr>
-        <w:t>)</w:t>
+      <w:r>
+        <w:rPr>
+          <w:rFonts w:ascii="Times New Roman" w:hAnsi="Times New Roman" w:cs="Times New Roman"/>
+        </w:rPr>
+        <w:t>DeleteActivity()</w:t>
       </w:r>
       <w:r>
         <w:rPr>
@@ -7694,7 +7498,6 @@
         </w:rPr>
       </w:pPr>
       <w:proofErr w:type="spellStart"/>
-      <w:proofErr w:type="gramStart"/>
       <w:r>
         <w:rPr>
           <w:rFonts w:ascii="Times New Roman" w:hAnsi="Times New Roman" w:cs="Times New Roman"/>
@@ -7706,14 +7509,7 @@
         <w:rPr>
           <w:rFonts w:ascii="Times New Roman" w:hAnsi="Times New Roman" w:cs="Times New Roman"/>
         </w:rPr>
-        <w:t>(</w:t>
-      </w:r>
-      <w:proofErr w:type="gramEnd"/>
-      <w:r>
-        <w:rPr>
-          <w:rFonts w:ascii="Times New Roman" w:hAnsi="Times New Roman" w:cs="Times New Roman"/>
-        </w:rPr>
-        <w:t>)</w:t>
+        <w:t>()</w:t>
       </w:r>
       <w:r>
         <w:rPr>
@@ -7752,19 +7548,11 @@
           <w:rFonts w:ascii="Times New Roman" w:hAnsi="Times New Roman" w:cs="Times New Roman"/>
         </w:rPr>
       </w:pPr>
-      <w:proofErr w:type="gramStart"/>
-      <w:r>
-        <w:rPr>
-          <w:rFonts w:ascii="Times New Roman" w:hAnsi="Times New Roman" w:cs="Times New Roman"/>
-        </w:rPr>
-        <w:t>GetActivity(</w:t>
-      </w:r>
-      <w:proofErr w:type="gramEnd"/>
-      <w:r>
-        <w:rPr>
-          <w:rFonts w:ascii="Times New Roman" w:hAnsi="Times New Roman" w:cs="Times New Roman"/>
-        </w:rPr>
-        <w:t>)</w:t>
+      <w:r>
+        <w:rPr>
+          <w:rFonts w:ascii="Times New Roman" w:hAnsi="Times New Roman" w:cs="Times New Roman"/>
+        </w:rPr>
+        <w:t>GetActivity()</w:t>
       </w:r>
       <w:r>
         <w:rPr>
@@ -7879,7 +7667,6 @@
               </w:rPr>
             </w:pPr>
             <w:proofErr w:type="spellStart"/>
-            <w:proofErr w:type="gramStart"/>
             <w:r>
               <w:rPr>
                 <w:rFonts w:ascii="Times New Roman" w:hAnsi="Times New Roman" w:cs="Times New Roman"/>
@@ -7891,14 +7678,7 @@
               <w:rPr>
                 <w:rFonts w:ascii="Times New Roman" w:hAnsi="Times New Roman" w:cs="Times New Roman"/>
               </w:rPr>
-              <w:t xml:space="preserve"> :</w:t>
-            </w:r>
-            <w:proofErr w:type="gramEnd"/>
-            <w:r>
-              <w:rPr>
-                <w:rFonts w:ascii="Times New Roman" w:hAnsi="Times New Roman" w:cs="Times New Roman"/>
-              </w:rPr>
-              <w:t xml:space="preserve"> int</w:t>
+              <w:t xml:space="preserve"> : int</w:t>
             </w:r>
           </w:p>
           <w:p>
@@ -7915,18 +7695,12 @@
               </w:rPr>
               <w:t>GroupName</w:t>
             </w:r>
-            <w:r>
-              <w:rPr>
-                <w:rFonts w:ascii="Times New Roman" w:hAnsi="Times New Roman" w:cs="Times New Roman"/>
-              </w:rPr>
-              <w:t xml:space="preserve"> :</w:t>
-            </w:r>
             <w:proofErr w:type="gramEnd"/>
             <w:r>
               <w:rPr>
                 <w:rFonts w:ascii="Times New Roman" w:hAnsi="Times New Roman" w:cs="Times New Roman"/>
               </w:rPr>
-              <w:t xml:space="preserve"> string</w:t>
+              <w:t xml:space="preserve"> : string</w:t>
             </w:r>
           </w:p>
           <w:p>
@@ -7937,7 +7711,6 @@
               </w:rPr>
             </w:pPr>
             <w:proofErr w:type="spellStart"/>
-            <w:proofErr w:type="gramStart"/>
             <w:r>
               <w:rPr>
                 <w:rFonts w:ascii="Times New Roman" w:hAnsi="Times New Roman" w:cs="Times New Roman"/>
@@ -7949,14 +7722,7 @@
               <w:rPr>
                 <w:rFonts w:ascii="Times New Roman" w:hAnsi="Times New Roman" w:cs="Times New Roman"/>
               </w:rPr>
-              <w:t xml:space="preserve"> :</w:t>
-            </w:r>
-            <w:proofErr w:type="gramEnd"/>
-            <w:r>
-              <w:rPr>
-                <w:rFonts w:ascii="Times New Roman" w:hAnsi="Times New Roman" w:cs="Times New Roman"/>
-              </w:rPr>
-              <w:t xml:space="preserve"> int</w:t>
+              <w:t xml:space="preserve"> : int</w:t>
             </w:r>
           </w:p>
           <w:p>
@@ -7966,7 +7732,6 @@
                 <w:rFonts w:ascii="Times New Roman" w:hAnsi="Times New Roman" w:cs="Times New Roman"/>
               </w:rPr>
             </w:pPr>
-            <w:proofErr w:type="gramStart"/>
             <w:r>
               <w:rPr>
                 <w:rFonts w:ascii="Times New Roman" w:hAnsi="Times New Roman" w:cs="Times New Roman"/>
@@ -7983,14 +7748,7 @@
               <w:rPr>
                 <w:rFonts w:ascii="Times New Roman" w:hAnsi="Times New Roman" w:cs="Times New Roman"/>
               </w:rPr>
-              <w:t xml:space="preserve"> :</w:t>
-            </w:r>
-            <w:proofErr w:type="gramEnd"/>
-            <w:r>
-              <w:rPr>
-                <w:rFonts w:ascii="Times New Roman" w:hAnsi="Times New Roman" w:cs="Times New Roman"/>
-              </w:rPr>
-              <w:t xml:space="preserve"> list&lt;User&gt;</w:t>
+              <w:t xml:space="preserve"> : list&lt;User&gt;</w:t>
             </w:r>
           </w:p>
           <w:p>
@@ -8001,7 +7759,6 @@
               </w:rPr>
             </w:pPr>
             <w:proofErr w:type="spellStart"/>
-            <w:proofErr w:type="gramStart"/>
             <w:r>
               <w:rPr>
                 <w:rFonts w:ascii="Times New Roman" w:hAnsi="Times New Roman" w:cs="Times New Roman"/>
@@ -8013,14 +7770,7 @@
               <w:rPr>
                 <w:rFonts w:ascii="Times New Roman" w:hAnsi="Times New Roman" w:cs="Times New Roman"/>
               </w:rPr>
-              <w:t xml:space="preserve"> :</w:t>
-            </w:r>
-            <w:proofErr w:type="gramEnd"/>
-            <w:r>
-              <w:rPr>
-                <w:rFonts w:ascii="Times New Roman" w:hAnsi="Times New Roman" w:cs="Times New Roman"/>
-              </w:rPr>
-              <w:t xml:space="preserve"> leaderboard</w:t>
+              <w:t xml:space="preserve"> : leaderboard</w:t>
             </w:r>
           </w:p>
         </w:tc>
@@ -8061,7 +7811,6 @@
                 <w:rFonts w:ascii="Times New Roman" w:hAnsi="Times New Roman" w:cs="Times New Roman"/>
               </w:rPr>
             </w:pPr>
-            <w:proofErr w:type="gramStart"/>
             <w:r>
               <w:rPr>
                 <w:rFonts w:ascii="Times New Roman" w:hAnsi="Times New Roman" w:cs="Times New Roman"/>
@@ -8072,14 +7821,7 @@
               <w:rPr>
                 <w:rFonts w:ascii="Times New Roman" w:hAnsi="Times New Roman" w:cs="Times New Roman"/>
               </w:rPr>
-              <w:t>reateGroup(</w:t>
-            </w:r>
-            <w:proofErr w:type="gramEnd"/>
-            <w:r>
-              <w:rPr>
-                <w:rFonts w:ascii="Times New Roman" w:hAnsi="Times New Roman" w:cs="Times New Roman"/>
-              </w:rPr>
-              <w:t>)</w:t>
+              <w:t>reateGroup()</w:t>
             </w:r>
           </w:p>
           <w:p>
@@ -8089,19 +7831,11 @@
                 <w:rFonts w:ascii="Times New Roman" w:hAnsi="Times New Roman" w:cs="Times New Roman"/>
               </w:rPr>
             </w:pPr>
-            <w:proofErr w:type="gramStart"/>
-            <w:r>
-              <w:rPr>
-                <w:rFonts w:ascii="Times New Roman" w:hAnsi="Times New Roman" w:cs="Times New Roman"/>
-              </w:rPr>
-              <w:t>RequestToJoin(</w:t>
-            </w:r>
-            <w:proofErr w:type="gramEnd"/>
-            <w:r>
-              <w:rPr>
-                <w:rFonts w:ascii="Times New Roman" w:hAnsi="Times New Roman" w:cs="Times New Roman"/>
-              </w:rPr>
-              <w:t>)</w:t>
+            <w:r>
+              <w:rPr>
+                <w:rFonts w:ascii="Times New Roman" w:hAnsi="Times New Roman" w:cs="Times New Roman"/>
+              </w:rPr>
+              <w:t>RequestToJoin()</w:t>
             </w:r>
           </w:p>
           <w:p>
@@ -8111,19 +7845,11 @@
                 <w:rFonts w:ascii="Times New Roman" w:hAnsi="Times New Roman" w:cs="Times New Roman"/>
               </w:rPr>
             </w:pPr>
-            <w:proofErr w:type="gramStart"/>
-            <w:r>
-              <w:rPr>
-                <w:rFonts w:ascii="Times New Roman" w:hAnsi="Times New Roman" w:cs="Times New Roman"/>
-              </w:rPr>
-              <w:t>ApproveMember(</w:t>
-            </w:r>
-            <w:proofErr w:type="gramEnd"/>
-            <w:r>
-              <w:rPr>
-                <w:rFonts w:ascii="Times New Roman" w:hAnsi="Times New Roman" w:cs="Times New Roman"/>
-              </w:rPr>
-              <w:t>)</w:t>
+            <w:r>
+              <w:rPr>
+                <w:rFonts w:ascii="Times New Roman" w:hAnsi="Times New Roman" w:cs="Times New Roman"/>
+              </w:rPr>
+              <w:t>ApproveMember()</w:t>
             </w:r>
           </w:p>
           <w:p>
@@ -8133,19 +7859,11 @@
                 <w:rFonts w:ascii="Times New Roman" w:hAnsi="Times New Roman" w:cs="Times New Roman"/>
               </w:rPr>
             </w:pPr>
-            <w:proofErr w:type="gramStart"/>
-            <w:r>
-              <w:rPr>
-                <w:rFonts w:ascii="Times New Roman" w:hAnsi="Times New Roman" w:cs="Times New Roman"/>
-              </w:rPr>
-              <w:t>RemoveMember(</w:t>
-            </w:r>
-            <w:proofErr w:type="gramEnd"/>
-            <w:r>
-              <w:rPr>
-                <w:rFonts w:ascii="Times New Roman" w:hAnsi="Times New Roman" w:cs="Times New Roman"/>
-              </w:rPr>
-              <w:t>)</w:t>
+            <w:r>
+              <w:rPr>
+                <w:rFonts w:ascii="Times New Roman" w:hAnsi="Times New Roman" w:cs="Times New Roman"/>
+              </w:rPr>
+              <w:t>RemoveMember()</w:t>
             </w:r>
           </w:p>
           <w:p>
@@ -8155,19 +7873,11 @@
                 <w:rFonts w:ascii="Times New Roman" w:hAnsi="Times New Roman" w:cs="Times New Roman"/>
               </w:rPr>
             </w:pPr>
-            <w:proofErr w:type="gramStart"/>
-            <w:r>
-              <w:rPr>
-                <w:rFonts w:ascii="Times New Roman" w:hAnsi="Times New Roman" w:cs="Times New Roman"/>
-              </w:rPr>
-              <w:t>ViewLeaderboard(</w:t>
-            </w:r>
-            <w:proofErr w:type="gramEnd"/>
-            <w:r>
-              <w:rPr>
-                <w:rFonts w:ascii="Times New Roman" w:hAnsi="Times New Roman" w:cs="Times New Roman"/>
-              </w:rPr>
-              <w:t>)</w:t>
+            <w:r>
+              <w:rPr>
+                <w:rFonts w:ascii="Times New Roman" w:hAnsi="Times New Roman" w:cs="Times New Roman"/>
+              </w:rPr>
+              <w:t>ViewLeaderboard()</w:t>
             </w:r>
           </w:p>
         </w:tc>
@@ -8357,19 +8067,11 @@
           <w:rFonts w:ascii="Times New Roman" w:hAnsi="Times New Roman" w:cs="Times New Roman"/>
         </w:rPr>
       </w:pPr>
-      <w:proofErr w:type="gramStart"/>
-      <w:r>
-        <w:rPr>
-          <w:rFonts w:ascii="Times New Roman" w:hAnsi="Times New Roman" w:cs="Times New Roman"/>
-        </w:rPr>
-        <w:t>CreateGroup(</w:t>
-      </w:r>
-      <w:proofErr w:type="gramEnd"/>
-      <w:r>
-        <w:rPr>
-          <w:rFonts w:ascii="Times New Roman" w:hAnsi="Times New Roman" w:cs="Times New Roman"/>
-        </w:rPr>
-        <w:t xml:space="preserve">) – Creates new group and </w:t>
+      <w:r>
+        <w:rPr>
+          <w:rFonts w:ascii="Times New Roman" w:hAnsi="Times New Roman" w:cs="Times New Roman"/>
+        </w:rPr>
+        <w:t xml:space="preserve">CreateGroup() – Creates new group and </w:t>
       </w:r>
       <w:r>
         <w:rPr>
@@ -8390,19 +8092,11 @@
           <w:rFonts w:ascii="Times New Roman" w:hAnsi="Times New Roman" w:cs="Times New Roman"/>
         </w:rPr>
       </w:pPr>
-      <w:proofErr w:type="gramStart"/>
-      <w:r>
-        <w:rPr>
-          <w:rFonts w:ascii="Times New Roman" w:hAnsi="Times New Roman" w:cs="Times New Roman"/>
-        </w:rPr>
-        <w:t>RequestToJoin(</w:t>
-      </w:r>
-      <w:proofErr w:type="gramEnd"/>
-      <w:r>
-        <w:rPr>
-          <w:rFonts w:ascii="Times New Roman" w:hAnsi="Times New Roman" w:cs="Times New Roman"/>
-        </w:rPr>
-        <w:t>)</w:t>
+      <w:r>
+        <w:rPr>
+          <w:rFonts w:ascii="Times New Roman" w:hAnsi="Times New Roman" w:cs="Times New Roman"/>
+        </w:rPr>
+        <w:t>RequestToJoin()</w:t>
       </w:r>
       <w:r>
         <w:rPr>
@@ -8423,19 +8117,11 @@
           <w:rFonts w:ascii="Times New Roman" w:hAnsi="Times New Roman" w:cs="Times New Roman"/>
         </w:rPr>
       </w:pPr>
-      <w:proofErr w:type="gramStart"/>
-      <w:r>
-        <w:rPr>
-          <w:rFonts w:ascii="Times New Roman" w:hAnsi="Times New Roman" w:cs="Times New Roman"/>
-        </w:rPr>
-        <w:t>ApproveMember(</w:t>
-      </w:r>
-      <w:proofErr w:type="gramEnd"/>
-      <w:r>
-        <w:rPr>
-          <w:rFonts w:ascii="Times New Roman" w:hAnsi="Times New Roman" w:cs="Times New Roman"/>
-        </w:rPr>
-        <w:t>)</w:t>
+      <w:r>
+        <w:rPr>
+          <w:rFonts w:ascii="Times New Roman" w:hAnsi="Times New Roman" w:cs="Times New Roman"/>
+        </w:rPr>
+        <w:t>ApproveMember()</w:t>
       </w:r>
       <w:r>
         <w:rPr>
@@ -8456,19 +8142,11 @@
           <w:rFonts w:ascii="Times New Roman" w:hAnsi="Times New Roman" w:cs="Times New Roman"/>
         </w:rPr>
       </w:pPr>
-      <w:proofErr w:type="gramStart"/>
-      <w:r>
-        <w:rPr>
-          <w:rFonts w:ascii="Times New Roman" w:hAnsi="Times New Roman" w:cs="Times New Roman"/>
-        </w:rPr>
-        <w:t>RemoveMember(</w:t>
-      </w:r>
-      <w:proofErr w:type="gramEnd"/>
-      <w:r>
-        <w:rPr>
-          <w:rFonts w:ascii="Times New Roman" w:hAnsi="Times New Roman" w:cs="Times New Roman"/>
-        </w:rPr>
-        <w:t>)</w:t>
+      <w:r>
+        <w:rPr>
+          <w:rFonts w:ascii="Times New Roman" w:hAnsi="Times New Roman" w:cs="Times New Roman"/>
+        </w:rPr>
+        <w:t>RemoveMember()</w:t>
       </w:r>
       <w:r>
         <w:rPr>
@@ -8489,19 +8167,11 @@
           <w:rFonts w:ascii="Times New Roman" w:hAnsi="Times New Roman" w:cs="Times New Roman"/>
         </w:rPr>
       </w:pPr>
-      <w:proofErr w:type="gramStart"/>
-      <w:r>
-        <w:rPr>
-          <w:rFonts w:ascii="Times New Roman" w:hAnsi="Times New Roman" w:cs="Times New Roman"/>
-        </w:rPr>
-        <w:t>ViewLeaderboard(</w:t>
-      </w:r>
-      <w:proofErr w:type="gramEnd"/>
-      <w:r>
-        <w:rPr>
-          <w:rFonts w:ascii="Times New Roman" w:hAnsi="Times New Roman" w:cs="Times New Roman"/>
-        </w:rPr>
-        <w:t>)</w:t>
+      <w:r>
+        <w:rPr>
+          <w:rFonts w:ascii="Times New Roman" w:hAnsi="Times New Roman" w:cs="Times New Roman"/>
+        </w:rPr>
+        <w:t>ViewLeaderboard()</w:t>
       </w:r>
       <w:r>
         <w:rPr>
@@ -8629,7 +8299,6 @@
           <w:color w:val="000000" w:themeColor="text1"/>
         </w:rPr>
       </w:pPr>
-      <w:proofErr w:type="gramStart"/>
       <w:r>
         <w:rPr>
           <w:rFonts w:ascii="Times New Roman" w:hAnsi="Times New Roman" w:cs="Times New Roman"/>
@@ -8650,9 +8319,8 @@
           <w:iCs/>
           <w:color w:val="000000" w:themeColor="text1"/>
         </w:rPr>
-        <w:t>(</w:t>
-      </w:r>
-      <w:proofErr w:type="gramEnd"/>
+        <w:t>():</w:t>
+      </w:r>
       <w:r>
         <w:rPr>
           <w:rFonts w:ascii="Times New Roman" w:hAnsi="Times New Roman" w:cs="Times New Roman"/>
@@ -8662,9 +8330,196 @@
           <w:iCs/>
           <w:color w:val="000000" w:themeColor="text1"/>
         </w:rPr>
-        <w:t>):</w:t>
-      </w:r>
-      <w:r>
+        <w:t xml:space="preserve"> </w:t>
+      </w:r>
+    </w:p>
+    <w:p>
+      <w:pPr>
+        <w:spacing w:line="480" w:lineRule="auto"/>
+        <w:ind w:firstLine="720"/>
+        <w:rPr>
+          <w:rFonts w:ascii="Times New Roman" w:hAnsi="Times New Roman" w:cs="Times New Roman"/>
+          <w:color w:val="000000" w:themeColor="text1"/>
+        </w:rPr>
+      </w:pPr>
+      <w:r>
+        <w:rPr>
+          <w:rFonts w:ascii="Times New Roman" w:hAnsi="Times New Roman" w:cs="Times New Roman"/>
+          <w:b/>
+          <w:bCs/>
+          <w:color w:val="000000" w:themeColor="text1"/>
+        </w:rPr>
+        <w:t>Input:</w:t>
+      </w:r>
+      <w:r>
+        <w:rPr>
+          <w:rFonts w:ascii="Times New Roman" w:hAnsi="Times New Roman" w:cs="Times New Roman"/>
+          <w:b/>
+          <w:bCs/>
+          <w:color w:val="000000" w:themeColor="text1"/>
+        </w:rPr>
+        <w:t xml:space="preserve"> </w:t>
+      </w:r>
+      <w:r>
+        <w:rPr>
+          <w:rFonts w:ascii="Times New Roman" w:hAnsi="Times New Roman" w:cs="Times New Roman"/>
+          <w:color w:val="000000" w:themeColor="text1"/>
+        </w:rPr>
+        <w:t>CreateActivity will take in user data that is placed into a list</w:t>
+      </w:r>
+    </w:p>
+    <w:p>
+      <w:pPr>
+        <w:spacing w:line="480" w:lineRule="auto"/>
+        <w:ind w:left="720"/>
+        <w:rPr>
+          <w:rFonts w:ascii="Times New Roman" w:hAnsi="Times New Roman" w:cs="Times New Roman"/>
+          <w:color w:val="000000" w:themeColor="text1"/>
+        </w:rPr>
+      </w:pPr>
+      <w:r>
+        <w:rPr>
+          <w:rFonts w:ascii="Times New Roman" w:hAnsi="Times New Roman" w:cs="Times New Roman"/>
+          <w:b/>
+          <w:bCs/>
+          <w:color w:val="000000" w:themeColor="text1"/>
+        </w:rPr>
+        <w:t>Output:</w:t>
+      </w:r>
+      <w:r>
+        <w:rPr>
+          <w:rFonts w:ascii="Times New Roman" w:hAnsi="Times New Roman" w:cs="Times New Roman"/>
+          <w:b/>
+          <w:bCs/>
+          <w:color w:val="000000" w:themeColor="text1"/>
+        </w:rPr>
+        <w:t xml:space="preserve"> </w:t>
+      </w:r>
+      <w:r>
+        <w:rPr>
+          <w:rFonts w:ascii="Times New Roman" w:hAnsi="Times New Roman" w:cs="Times New Roman"/>
+          <w:color w:val="000000" w:themeColor="text1"/>
+        </w:rPr>
+        <w:t xml:space="preserve">The function will output </w:t>
+      </w:r>
+      <w:r>
+        <w:rPr>
+          <w:rFonts w:ascii="Times New Roman" w:hAnsi="Times New Roman" w:cs="Times New Roman"/>
+          <w:color w:val="000000" w:themeColor="text1"/>
+        </w:rPr>
+        <w:t xml:space="preserve">a success or error message depending on </w:t>
+      </w:r>
+      <w:proofErr w:type="gramStart"/>
+      <w:r>
+        <w:rPr>
+          <w:rFonts w:ascii="Times New Roman" w:hAnsi="Times New Roman" w:cs="Times New Roman"/>
+          <w:color w:val="000000" w:themeColor="text1"/>
+        </w:rPr>
+        <w:t>whether or not</w:t>
+      </w:r>
+      <w:proofErr w:type="gramEnd"/>
+      <w:r>
+        <w:rPr>
+          <w:rFonts w:ascii="Times New Roman" w:hAnsi="Times New Roman" w:cs="Times New Roman"/>
+          <w:color w:val="000000" w:themeColor="text1"/>
+        </w:rPr>
+        <w:t xml:space="preserve"> the user enters all required data</w:t>
+      </w:r>
+    </w:p>
+    <w:p>
+      <w:pPr>
+        <w:spacing w:line="480" w:lineRule="auto"/>
+        <w:ind w:left="720"/>
+        <w:rPr>
+          <w:rFonts w:ascii="Times New Roman" w:hAnsi="Times New Roman" w:cs="Times New Roman"/>
+          <w:color w:val="000000" w:themeColor="text1"/>
+        </w:rPr>
+      </w:pPr>
+      <w:r>
+        <w:rPr>
+          <w:rFonts w:ascii="Times New Roman" w:hAnsi="Times New Roman" w:cs="Times New Roman"/>
+          <w:b/>
+          <w:bCs/>
+          <w:color w:val="000000" w:themeColor="text1"/>
+        </w:rPr>
+        <w:t>Return Parameters</w:t>
+      </w:r>
+      <w:r>
+        <w:rPr>
+          <w:rFonts w:ascii="Times New Roman" w:hAnsi="Times New Roman" w:cs="Times New Roman"/>
+          <w:b/>
+          <w:bCs/>
+          <w:color w:val="000000" w:themeColor="text1"/>
+        </w:rPr>
+        <w:t xml:space="preserve">: </w:t>
+      </w:r>
+      <w:r>
+        <w:rPr>
+          <w:rFonts w:ascii="Times New Roman" w:hAnsi="Times New Roman" w:cs="Times New Roman"/>
+          <w:color w:val="000000" w:themeColor="text1"/>
+        </w:rPr>
+        <w:t xml:space="preserve">The only values that will be returned will be </w:t>
+      </w:r>
+      <w:r>
+        <w:rPr>
+          <w:rFonts w:ascii="Times New Roman" w:hAnsi="Times New Roman" w:cs="Times New Roman"/>
+          <w:color w:val="000000" w:themeColor="text1"/>
+        </w:rPr>
+        <w:t>exceptions thrown during error checking, i.e.  missing required data</w:t>
+      </w:r>
+    </w:p>
+    <w:p>
+      <w:pPr>
+        <w:spacing w:line="480" w:lineRule="auto"/>
+        <w:ind w:left="720"/>
+        <w:rPr>
+          <w:rFonts w:ascii="Times New Roman" w:hAnsi="Times New Roman" w:cs="Times New Roman"/>
+          <w:color w:val="000000" w:themeColor="text1"/>
+        </w:rPr>
+      </w:pPr>
+      <w:r>
+        <w:rPr>
+          <w:rFonts w:ascii="Times New Roman" w:hAnsi="Times New Roman" w:cs="Times New Roman"/>
+          <w:b/>
+          <w:bCs/>
+          <w:color w:val="000000" w:themeColor="text1"/>
+        </w:rPr>
+        <w:t>Types</w:t>
+      </w:r>
+      <w:r>
+        <w:rPr>
+          <w:rFonts w:ascii="Times New Roman" w:hAnsi="Times New Roman" w:cs="Times New Roman"/>
+          <w:b/>
+          <w:bCs/>
+          <w:color w:val="000000" w:themeColor="text1"/>
+        </w:rPr>
+        <w:t xml:space="preserve">: </w:t>
+      </w:r>
+      <w:r>
+        <w:rPr>
+          <w:rFonts w:ascii="Times New Roman" w:hAnsi="Times New Roman" w:cs="Times New Roman"/>
+          <w:color w:val="000000" w:themeColor="text1"/>
+        </w:rPr>
+        <w:t>The user list will contain strings</w:t>
+      </w:r>
+      <w:r>
+        <w:rPr>
+          <w:rFonts w:ascii="Times New Roman" w:hAnsi="Times New Roman" w:cs="Times New Roman"/>
+          <w:color w:val="000000" w:themeColor="text1"/>
+        </w:rPr>
+        <w:t>, integers,</w:t>
+      </w:r>
+      <w:r>
+        <w:rPr>
+          <w:rFonts w:ascii="Times New Roman" w:hAnsi="Times New Roman" w:cs="Times New Roman"/>
+          <w:color w:val="000000" w:themeColor="text1"/>
+        </w:rPr>
+        <w:t xml:space="preserve"> and Python’s datetime type imported from the datetime library</w:t>
+      </w:r>
+    </w:p>
+    <w:p>
+      <w:pPr>
+        <w:spacing w:line="480" w:lineRule="auto"/>
         <w:rPr>
           <w:rFonts w:ascii="Times New Roman" w:hAnsi="Times New Roman" w:cs="Times New Roman"/>
           <w:b/>
@@ -8673,196 +8528,9 @@
           <w:iCs/>
           <w:color w:val="000000" w:themeColor="text1"/>
         </w:rPr>
-        <w:t xml:space="preserve"> </w:t>
-      </w:r>
-    </w:p>
-    <w:p>
-      <w:pPr>
-        <w:spacing w:line="480" w:lineRule="auto"/>
-        <w:ind w:firstLine="720"/>
-        <w:rPr>
-          <w:rFonts w:ascii="Times New Roman" w:hAnsi="Times New Roman" w:cs="Times New Roman"/>
-          <w:color w:val="000000" w:themeColor="text1"/>
-        </w:rPr>
-      </w:pPr>
-      <w:r>
-        <w:rPr>
-          <w:rFonts w:ascii="Times New Roman" w:hAnsi="Times New Roman" w:cs="Times New Roman"/>
-          <w:b/>
-          <w:bCs/>
-          <w:color w:val="000000" w:themeColor="text1"/>
-        </w:rPr>
-        <w:t>Input:</w:t>
-      </w:r>
-      <w:r>
-        <w:rPr>
-          <w:rFonts w:ascii="Times New Roman" w:hAnsi="Times New Roman" w:cs="Times New Roman"/>
-          <w:b/>
-          <w:bCs/>
-          <w:color w:val="000000" w:themeColor="text1"/>
-        </w:rPr>
-        <w:t xml:space="preserve"> </w:t>
-      </w:r>
-      <w:r>
-        <w:rPr>
-          <w:rFonts w:ascii="Times New Roman" w:hAnsi="Times New Roman" w:cs="Times New Roman"/>
-          <w:color w:val="000000" w:themeColor="text1"/>
-        </w:rPr>
-        <w:t>CreateActivity will take in user data that is placed into a list</w:t>
-      </w:r>
-    </w:p>
-    <w:p>
-      <w:pPr>
-        <w:spacing w:line="480" w:lineRule="auto"/>
-        <w:ind w:left="720"/>
-        <w:rPr>
-          <w:rFonts w:ascii="Times New Roman" w:hAnsi="Times New Roman" w:cs="Times New Roman"/>
-          <w:color w:val="000000" w:themeColor="text1"/>
-        </w:rPr>
-      </w:pPr>
-      <w:r>
-        <w:rPr>
-          <w:rFonts w:ascii="Times New Roman" w:hAnsi="Times New Roman" w:cs="Times New Roman"/>
-          <w:b/>
-          <w:bCs/>
-          <w:color w:val="000000" w:themeColor="text1"/>
-        </w:rPr>
-        <w:t>Output:</w:t>
-      </w:r>
-      <w:r>
-        <w:rPr>
-          <w:rFonts w:ascii="Times New Roman" w:hAnsi="Times New Roman" w:cs="Times New Roman"/>
-          <w:b/>
-          <w:bCs/>
-          <w:color w:val="000000" w:themeColor="text1"/>
-        </w:rPr>
-        <w:t xml:space="preserve"> </w:t>
-      </w:r>
-      <w:r>
-        <w:rPr>
-          <w:rFonts w:ascii="Times New Roman" w:hAnsi="Times New Roman" w:cs="Times New Roman"/>
-          <w:color w:val="000000" w:themeColor="text1"/>
-        </w:rPr>
-        <w:t xml:space="preserve">The function will output </w:t>
-      </w:r>
-      <w:r>
-        <w:rPr>
-          <w:rFonts w:ascii="Times New Roman" w:hAnsi="Times New Roman" w:cs="Times New Roman"/>
-          <w:color w:val="000000" w:themeColor="text1"/>
-        </w:rPr>
-        <w:t xml:space="preserve">a success or error message depending on </w:t>
-      </w:r>
-      <w:proofErr w:type="gramStart"/>
-      <w:r>
-        <w:rPr>
-          <w:rFonts w:ascii="Times New Roman" w:hAnsi="Times New Roman" w:cs="Times New Roman"/>
-          <w:color w:val="000000" w:themeColor="text1"/>
-        </w:rPr>
-        <w:t>whether or not</w:t>
-      </w:r>
-      <w:proofErr w:type="gramEnd"/>
-      <w:r>
-        <w:rPr>
-          <w:rFonts w:ascii="Times New Roman" w:hAnsi="Times New Roman" w:cs="Times New Roman"/>
-          <w:color w:val="000000" w:themeColor="text1"/>
-        </w:rPr>
-        <w:t xml:space="preserve"> the user enters all required data</w:t>
-      </w:r>
-    </w:p>
-    <w:p>
-      <w:pPr>
-        <w:spacing w:line="480" w:lineRule="auto"/>
-        <w:ind w:left="720"/>
-        <w:rPr>
-          <w:rFonts w:ascii="Times New Roman" w:hAnsi="Times New Roman" w:cs="Times New Roman"/>
-          <w:color w:val="000000" w:themeColor="text1"/>
-        </w:rPr>
-      </w:pPr>
-      <w:r>
-        <w:rPr>
-          <w:rFonts w:ascii="Times New Roman" w:hAnsi="Times New Roman" w:cs="Times New Roman"/>
-          <w:b/>
-          <w:bCs/>
-          <w:color w:val="000000" w:themeColor="text1"/>
-        </w:rPr>
-        <w:t>Return Parameters</w:t>
-      </w:r>
-      <w:r>
-        <w:rPr>
-          <w:rFonts w:ascii="Times New Roman" w:hAnsi="Times New Roman" w:cs="Times New Roman"/>
-          <w:b/>
-          <w:bCs/>
-          <w:color w:val="000000" w:themeColor="text1"/>
-        </w:rPr>
-        <w:t xml:space="preserve">: </w:t>
-      </w:r>
-      <w:r>
-        <w:rPr>
-          <w:rFonts w:ascii="Times New Roman" w:hAnsi="Times New Roman" w:cs="Times New Roman"/>
-          <w:color w:val="000000" w:themeColor="text1"/>
-        </w:rPr>
-        <w:t xml:space="preserve">The only values that will be returned will be </w:t>
-      </w:r>
-      <w:r>
-        <w:rPr>
-          <w:rFonts w:ascii="Times New Roman" w:hAnsi="Times New Roman" w:cs="Times New Roman"/>
-          <w:color w:val="000000" w:themeColor="text1"/>
-        </w:rPr>
-        <w:t>exceptions thrown during error checking, i.e.  missing required data</w:t>
-      </w:r>
-    </w:p>
-    <w:p>
-      <w:pPr>
-        <w:spacing w:line="480" w:lineRule="auto"/>
-        <w:ind w:left="720"/>
-        <w:rPr>
-          <w:rFonts w:ascii="Times New Roman" w:hAnsi="Times New Roman" w:cs="Times New Roman"/>
-          <w:color w:val="000000" w:themeColor="text1"/>
-        </w:rPr>
-      </w:pPr>
-      <w:r>
-        <w:rPr>
-          <w:rFonts w:ascii="Times New Roman" w:hAnsi="Times New Roman" w:cs="Times New Roman"/>
-          <w:b/>
-          <w:bCs/>
-          <w:color w:val="000000" w:themeColor="text1"/>
-        </w:rPr>
-        <w:t>Types</w:t>
-      </w:r>
-      <w:r>
-        <w:rPr>
-          <w:rFonts w:ascii="Times New Roman" w:hAnsi="Times New Roman" w:cs="Times New Roman"/>
-          <w:b/>
-          <w:bCs/>
-          <w:color w:val="000000" w:themeColor="text1"/>
-        </w:rPr>
-        <w:t xml:space="preserve">: </w:t>
-      </w:r>
-      <w:r>
-        <w:rPr>
-          <w:rFonts w:ascii="Times New Roman" w:hAnsi="Times New Roman" w:cs="Times New Roman"/>
-          <w:color w:val="000000" w:themeColor="text1"/>
-        </w:rPr>
-        <w:t>The user list will contain strings</w:t>
-      </w:r>
-      <w:r>
-        <w:rPr>
-          <w:rFonts w:ascii="Times New Roman" w:hAnsi="Times New Roman" w:cs="Times New Roman"/>
-          <w:color w:val="000000" w:themeColor="text1"/>
-        </w:rPr>
-        <w:t>, integers,</w:t>
-      </w:r>
-      <w:r>
-        <w:rPr>
-          <w:rFonts w:ascii="Times New Roman" w:hAnsi="Times New Roman" w:cs="Times New Roman"/>
-          <w:color w:val="000000" w:themeColor="text1"/>
-        </w:rPr>
-        <w:t xml:space="preserve"> and Python’s datetime type imported from the datetime library</w:t>
-      </w:r>
-    </w:p>
-    <w:p>
-      <w:pPr>
-        <w:spacing w:line="480" w:lineRule="auto"/>
+      </w:pPr>
+      <w:proofErr w:type="spellStart"/>
+      <w:r>
         <w:rPr>
           <w:rFonts w:ascii="Times New Roman" w:hAnsi="Times New Roman" w:cs="Times New Roman"/>
           <w:b/>
@@ -8871,9 +8539,9 @@
           <w:iCs/>
           <w:color w:val="000000" w:themeColor="text1"/>
         </w:rPr>
-      </w:pPr>
-      <w:proofErr w:type="spellStart"/>
-      <w:proofErr w:type="gramStart"/>
+        <w:t>CalculatePace</w:t>
+      </w:r>
+      <w:proofErr w:type="spellEnd"/>
       <w:r>
         <w:rPr>
           <w:rFonts w:ascii="Times New Roman" w:hAnsi="Times New Roman" w:cs="Times New Roman"/>
@@ -8883,10 +8551,130 @@
           <w:iCs/>
           <w:color w:val="000000" w:themeColor="text1"/>
         </w:rPr>
-        <w:t>CalculatePace</w:t>
-      </w:r>
-      <w:proofErr w:type="spellEnd"/>
-      <w:r>
+        <w:t xml:space="preserve">(): </w:t>
+      </w:r>
+    </w:p>
+    <w:p>
+      <w:pPr>
+        <w:spacing w:line="480" w:lineRule="auto"/>
+        <w:ind w:left="720"/>
+        <w:rPr>
+          <w:rFonts w:ascii="Times New Roman" w:hAnsi="Times New Roman" w:cs="Times New Roman"/>
+          <w:color w:val="000000" w:themeColor="text1"/>
+        </w:rPr>
+      </w:pPr>
+      <w:r>
+        <w:rPr>
+          <w:rFonts w:ascii="Times New Roman" w:hAnsi="Times New Roman" w:cs="Times New Roman"/>
+          <w:b/>
+          <w:bCs/>
+          <w:color w:val="000000" w:themeColor="text1"/>
+        </w:rPr>
+        <w:t xml:space="preserve">Input: </w:t>
+      </w:r>
+      <w:r>
+        <w:rPr>
+          <w:rFonts w:ascii="Times New Roman" w:hAnsi="Times New Roman" w:cs="Times New Roman"/>
+          <w:color w:val="000000" w:themeColor="text1"/>
+        </w:rPr>
+        <w:t>This function will take the pace input and duration input if the activity they are entering requires those fields</w:t>
+      </w:r>
+    </w:p>
+    <w:p>
+      <w:pPr>
+        <w:spacing w:line="480" w:lineRule="auto"/>
+        <w:ind w:left="720"/>
+        <w:rPr>
+          <w:rFonts w:ascii="Times New Roman" w:hAnsi="Times New Roman" w:cs="Times New Roman"/>
+          <w:color w:val="000000" w:themeColor="text1"/>
+        </w:rPr>
+      </w:pPr>
+      <w:r>
+        <w:rPr>
+          <w:rFonts w:ascii="Times New Roman" w:hAnsi="Times New Roman" w:cs="Times New Roman"/>
+          <w:b/>
+          <w:bCs/>
+          <w:color w:val="000000" w:themeColor="text1"/>
+        </w:rPr>
+        <w:t xml:space="preserve">Output: </w:t>
+      </w:r>
+      <w:r>
+        <w:rPr>
+          <w:rFonts w:ascii="Times New Roman" w:hAnsi="Times New Roman" w:cs="Times New Roman"/>
+          <w:color w:val="000000" w:themeColor="text1"/>
+        </w:rPr>
+        <w:t xml:space="preserve">The function will </w:t>
+      </w:r>
+      <w:r>
+        <w:rPr>
+          <w:rFonts w:ascii="Times New Roman" w:hAnsi="Times New Roman" w:cs="Times New Roman"/>
+          <w:color w:val="000000" w:themeColor="text1"/>
+        </w:rPr>
+        <w:t>calculate the pace of the activity and upload it into the database</w:t>
+      </w:r>
+    </w:p>
+    <w:p>
+      <w:pPr>
+        <w:spacing w:line="480" w:lineRule="auto"/>
+        <w:ind w:left="720"/>
+        <w:rPr>
+          <w:rFonts w:ascii="Times New Roman" w:hAnsi="Times New Roman" w:cs="Times New Roman"/>
+          <w:color w:val="000000" w:themeColor="text1"/>
+        </w:rPr>
+      </w:pPr>
+      <w:r>
+        <w:rPr>
+          <w:rFonts w:ascii="Times New Roman" w:hAnsi="Times New Roman" w:cs="Times New Roman"/>
+          <w:b/>
+          <w:bCs/>
+          <w:color w:val="000000" w:themeColor="text1"/>
+        </w:rPr>
+        <w:t xml:space="preserve">Return Parameters: </w:t>
+      </w:r>
+      <w:r>
+        <w:rPr>
+          <w:rFonts w:ascii="Times New Roman" w:hAnsi="Times New Roman" w:cs="Times New Roman"/>
+          <w:color w:val="000000" w:themeColor="text1"/>
+        </w:rPr>
+        <w:t>The only values that will be returned will be exceptions thrown during error checking, i.e.  missing data</w:t>
+      </w:r>
+    </w:p>
+    <w:p>
+      <w:pPr>
+        <w:spacing w:line="480" w:lineRule="auto"/>
+        <w:rPr>
+          <w:rFonts w:ascii="Times New Roman" w:hAnsi="Times New Roman" w:cs="Times New Roman"/>
+          <w:color w:val="000000" w:themeColor="text1"/>
+        </w:rPr>
+      </w:pPr>
+      <w:r>
+        <w:rPr>
+          <w:rFonts w:ascii="Times New Roman" w:hAnsi="Times New Roman" w:cs="Times New Roman"/>
+          <w:b/>
+          <w:bCs/>
+          <w:color w:val="000000" w:themeColor="text1"/>
+        </w:rPr>
+        <w:tab/>
+        <w:t xml:space="preserve">Types: </w:t>
+      </w:r>
+      <w:r>
+        <w:rPr>
+          <w:rFonts w:ascii="Times New Roman" w:hAnsi="Times New Roman" w:cs="Times New Roman"/>
+          <w:color w:val="000000" w:themeColor="text1"/>
+        </w:rPr>
+        <w:t xml:space="preserve">The user input will be </w:t>
+      </w:r>
+      <w:r>
+        <w:rPr>
+          <w:rFonts w:ascii="Times New Roman" w:hAnsi="Times New Roman" w:cs="Times New Roman"/>
+          <w:color w:val="000000" w:themeColor="text1"/>
+        </w:rPr>
+        <w:t>a Python time, imported from the datetime library</w:t>
+      </w:r>
+    </w:p>
+    <w:p>
+      <w:pPr>
+        <w:spacing w:line="480" w:lineRule="auto"/>
         <w:rPr>
           <w:rFonts w:ascii="Times New Roman" w:hAnsi="Times New Roman" w:cs="Times New Roman"/>
           <w:b/>
@@ -8895,9 +8683,7 @@
           <w:iCs/>
           <w:color w:val="000000" w:themeColor="text1"/>
         </w:rPr>
-        <w:t>(</w:t>
-      </w:r>
-      <w:proofErr w:type="gramEnd"/>
+      </w:pPr>
       <w:r>
         <w:rPr>
           <w:rFonts w:ascii="Times New Roman" w:hAnsi="Times New Roman" w:cs="Times New Roman"/>
@@ -8907,130 +8693,9 @@
           <w:iCs/>
           <w:color w:val="000000" w:themeColor="text1"/>
         </w:rPr>
-        <w:t xml:space="preserve">): </w:t>
-      </w:r>
-    </w:p>
-    <w:p>
-      <w:pPr>
-        <w:spacing w:line="480" w:lineRule="auto"/>
-        <w:ind w:left="720"/>
-        <w:rPr>
-          <w:rFonts w:ascii="Times New Roman" w:hAnsi="Times New Roman" w:cs="Times New Roman"/>
-          <w:color w:val="000000" w:themeColor="text1"/>
-        </w:rPr>
-      </w:pPr>
-      <w:r>
-        <w:rPr>
-          <w:rFonts w:ascii="Times New Roman" w:hAnsi="Times New Roman" w:cs="Times New Roman"/>
-          <w:b/>
-          <w:bCs/>
-          <w:color w:val="000000" w:themeColor="text1"/>
-        </w:rPr>
-        <w:t xml:space="preserve">Input: </w:t>
-      </w:r>
-      <w:r>
-        <w:rPr>
-          <w:rFonts w:ascii="Times New Roman" w:hAnsi="Times New Roman" w:cs="Times New Roman"/>
-          <w:color w:val="000000" w:themeColor="text1"/>
-        </w:rPr>
-        <w:t>This function will take the pace input and duration input if the activity they are entering requires those fields</w:t>
-      </w:r>
-    </w:p>
-    <w:p>
-      <w:pPr>
-        <w:spacing w:line="480" w:lineRule="auto"/>
-        <w:ind w:left="720"/>
-        <w:rPr>
-          <w:rFonts w:ascii="Times New Roman" w:hAnsi="Times New Roman" w:cs="Times New Roman"/>
-          <w:color w:val="000000" w:themeColor="text1"/>
-        </w:rPr>
-      </w:pPr>
-      <w:r>
-        <w:rPr>
-          <w:rFonts w:ascii="Times New Roman" w:hAnsi="Times New Roman" w:cs="Times New Roman"/>
-          <w:b/>
-          <w:bCs/>
-          <w:color w:val="000000" w:themeColor="text1"/>
-        </w:rPr>
-        <w:t xml:space="preserve">Output: </w:t>
-      </w:r>
-      <w:r>
-        <w:rPr>
-          <w:rFonts w:ascii="Times New Roman" w:hAnsi="Times New Roman" w:cs="Times New Roman"/>
-          <w:color w:val="000000" w:themeColor="text1"/>
-        </w:rPr>
-        <w:t xml:space="preserve">The function will </w:t>
-      </w:r>
-      <w:r>
-        <w:rPr>
-          <w:rFonts w:ascii="Times New Roman" w:hAnsi="Times New Roman" w:cs="Times New Roman"/>
-          <w:color w:val="000000" w:themeColor="text1"/>
-        </w:rPr>
-        <w:t>calculate the pace of the activity and upload it into the database</w:t>
-      </w:r>
-    </w:p>
-    <w:p>
-      <w:pPr>
-        <w:spacing w:line="480" w:lineRule="auto"/>
-        <w:ind w:left="720"/>
-        <w:rPr>
-          <w:rFonts w:ascii="Times New Roman" w:hAnsi="Times New Roman" w:cs="Times New Roman"/>
-          <w:color w:val="000000" w:themeColor="text1"/>
-        </w:rPr>
-      </w:pPr>
-      <w:r>
-        <w:rPr>
-          <w:rFonts w:ascii="Times New Roman" w:hAnsi="Times New Roman" w:cs="Times New Roman"/>
-          <w:b/>
-          <w:bCs/>
-          <w:color w:val="000000" w:themeColor="text1"/>
-        </w:rPr>
-        <w:t xml:space="preserve">Return Parameters: </w:t>
-      </w:r>
-      <w:r>
-        <w:rPr>
-          <w:rFonts w:ascii="Times New Roman" w:hAnsi="Times New Roman" w:cs="Times New Roman"/>
-          <w:color w:val="000000" w:themeColor="text1"/>
-        </w:rPr>
-        <w:t>The only values that will be returned will be exceptions thrown during error checking, i.e.  missing data</w:t>
-      </w:r>
-    </w:p>
-    <w:p>
-      <w:pPr>
-        <w:spacing w:line="480" w:lineRule="auto"/>
-        <w:rPr>
-          <w:rFonts w:ascii="Times New Roman" w:hAnsi="Times New Roman" w:cs="Times New Roman"/>
-          <w:color w:val="000000" w:themeColor="text1"/>
-        </w:rPr>
-      </w:pPr>
-      <w:r>
-        <w:rPr>
-          <w:rFonts w:ascii="Times New Roman" w:hAnsi="Times New Roman" w:cs="Times New Roman"/>
-          <w:b/>
-          <w:bCs/>
-          <w:color w:val="000000" w:themeColor="text1"/>
-        </w:rPr>
-        <w:tab/>
-        <w:t xml:space="preserve">Types: </w:t>
-      </w:r>
-      <w:r>
-        <w:rPr>
-          <w:rFonts w:ascii="Times New Roman" w:hAnsi="Times New Roman" w:cs="Times New Roman"/>
-          <w:color w:val="000000" w:themeColor="text1"/>
-        </w:rPr>
-        <w:t xml:space="preserve">The user input will be </w:t>
-      </w:r>
-      <w:r>
-        <w:rPr>
-          <w:rFonts w:ascii="Times New Roman" w:hAnsi="Times New Roman" w:cs="Times New Roman"/>
-          <w:color w:val="000000" w:themeColor="text1"/>
-        </w:rPr>
-        <w:t>a Python time, imported from the datetime library</w:t>
-      </w:r>
-    </w:p>
-    <w:p>
-      <w:pPr>
-        <w:spacing w:line="480" w:lineRule="auto"/>
+        <w:t>GetActivity</w:t>
+      </w:r>
+      <w:r>
         <w:rPr>
           <w:rFonts w:ascii="Times New Roman" w:hAnsi="Times New Roman" w:cs="Times New Roman"/>
           <w:b/>
@@ -9039,41 +8704,7 @@
           <w:iCs/>
           <w:color w:val="000000" w:themeColor="text1"/>
         </w:rPr>
-      </w:pPr>
-      <w:proofErr w:type="gramStart"/>
-      <w:r>
-        <w:rPr>
-          <w:rFonts w:ascii="Times New Roman" w:hAnsi="Times New Roman" w:cs="Times New Roman"/>
-          <w:b/>
-          <w:bCs/>
-          <w:i/>
-          <w:iCs/>
-          <w:color w:val="000000" w:themeColor="text1"/>
-        </w:rPr>
-        <w:t>GetActivity</w:t>
-      </w:r>
-      <w:r>
-        <w:rPr>
-          <w:rFonts w:ascii="Times New Roman" w:hAnsi="Times New Roman" w:cs="Times New Roman"/>
-          <w:b/>
-          <w:bCs/>
-          <w:i/>
-          <w:iCs/>
-          <w:color w:val="000000" w:themeColor="text1"/>
-        </w:rPr>
-        <w:t>(</w:t>
-      </w:r>
-      <w:proofErr w:type="gramEnd"/>
-      <w:r>
-        <w:rPr>
-          <w:rFonts w:ascii="Times New Roman" w:hAnsi="Times New Roman" w:cs="Times New Roman"/>
-          <w:b/>
-          <w:bCs/>
-          <w:i/>
-          <w:iCs/>
-          <w:color w:val="000000" w:themeColor="text1"/>
-        </w:rPr>
-        <w:t>):</w:t>
+        <w:t>():</w:t>
       </w:r>
     </w:p>
     <w:p>
@@ -9214,7 +8845,6 @@
           <w:color w:val="000000" w:themeColor="text1"/>
         </w:rPr>
       </w:pPr>
-      <w:proofErr w:type="gramStart"/>
       <w:r>
         <w:rPr>
           <w:rFonts w:ascii="Times New Roman" w:hAnsi="Times New Roman" w:cs="Times New Roman"/>
@@ -9235,160 +8865,157 @@
           <w:iCs/>
           <w:color w:val="000000" w:themeColor="text1"/>
         </w:rPr>
-        <w:t>(</w:t>
+        <w:t>():</w:t>
+      </w:r>
+    </w:p>
+    <w:p>
+      <w:pPr>
+        <w:spacing w:line="480" w:lineRule="auto"/>
+        <w:rPr>
+          <w:rFonts w:ascii="Times New Roman" w:hAnsi="Times New Roman" w:cs="Times New Roman"/>
+          <w:color w:val="000000" w:themeColor="text1"/>
+        </w:rPr>
+      </w:pPr>
+      <w:r>
+        <w:rPr>
+          <w:rFonts w:ascii="Times New Roman" w:hAnsi="Times New Roman" w:cs="Times New Roman"/>
+          <w:b/>
+          <w:bCs/>
+          <w:color w:val="000000" w:themeColor="text1"/>
+        </w:rPr>
+        <w:tab/>
+        <w:t>Input:</w:t>
+      </w:r>
+      <w:r>
+        <w:rPr>
+          <w:rFonts w:ascii="Times New Roman" w:hAnsi="Times New Roman" w:cs="Times New Roman"/>
+          <w:b/>
+          <w:bCs/>
+          <w:color w:val="000000" w:themeColor="text1"/>
+        </w:rPr>
+        <w:t xml:space="preserve"> </w:t>
+      </w:r>
+      <w:r>
+        <w:rPr>
+          <w:rFonts w:ascii="Times New Roman" w:hAnsi="Times New Roman" w:cs="Times New Roman"/>
+          <w:color w:val="000000" w:themeColor="text1"/>
+        </w:rPr>
+        <w:t>The function will receive the name of the activity that the user wishes to delete</w:t>
+      </w:r>
+    </w:p>
+    <w:p>
+      <w:pPr>
+        <w:spacing w:line="480" w:lineRule="auto"/>
+        <w:ind w:left="720"/>
+        <w:rPr>
+          <w:rFonts w:ascii="Times New Roman" w:hAnsi="Times New Roman" w:cs="Times New Roman"/>
+          <w:color w:val="000000" w:themeColor="text1"/>
+        </w:rPr>
+      </w:pPr>
+      <w:r>
+        <w:rPr>
+          <w:rFonts w:ascii="Times New Roman" w:hAnsi="Times New Roman" w:cs="Times New Roman"/>
+          <w:b/>
+          <w:bCs/>
+          <w:color w:val="000000" w:themeColor="text1"/>
+        </w:rPr>
+        <w:t xml:space="preserve">Output: </w:t>
+      </w:r>
+      <w:r>
+        <w:rPr>
+          <w:rFonts w:ascii="Times New Roman" w:hAnsi="Times New Roman" w:cs="Times New Roman"/>
+          <w:color w:val="000000" w:themeColor="text1"/>
+        </w:rPr>
+        <w:t xml:space="preserve">The function will output a success or error message depending on </w:t>
+      </w:r>
+      <w:proofErr w:type="gramStart"/>
+      <w:r>
+        <w:rPr>
+          <w:rFonts w:ascii="Times New Roman" w:hAnsi="Times New Roman" w:cs="Times New Roman"/>
+          <w:color w:val="000000" w:themeColor="text1"/>
+        </w:rPr>
+        <w:t>whether or not</w:t>
       </w:r>
       <w:proofErr w:type="gramEnd"/>
       <w:r>
         <w:rPr>
           <w:rFonts w:ascii="Times New Roman" w:hAnsi="Times New Roman" w:cs="Times New Roman"/>
-          <w:b/>
-          <w:bCs/>
+          <w:color w:val="000000" w:themeColor="text1"/>
+        </w:rPr>
+        <w:t xml:space="preserve"> the user enters all required data</w:t>
+      </w:r>
+    </w:p>
+    <w:p>
+      <w:pPr>
+        <w:spacing w:line="480" w:lineRule="auto"/>
+        <w:ind w:left="720"/>
+        <w:rPr>
+          <w:rFonts w:ascii="Times New Roman" w:hAnsi="Times New Roman" w:cs="Times New Roman"/>
+          <w:color w:val="000000" w:themeColor="text1"/>
+        </w:rPr>
+      </w:pPr>
+      <w:r>
+        <w:rPr>
+          <w:rFonts w:ascii="Times New Roman" w:hAnsi="Times New Roman" w:cs="Times New Roman"/>
+          <w:b/>
+          <w:bCs/>
+          <w:color w:val="000000" w:themeColor="text1"/>
+        </w:rPr>
+        <w:t xml:space="preserve">Return Parameters: </w:t>
+      </w:r>
+      <w:r>
+        <w:rPr>
+          <w:rFonts w:ascii="Times New Roman" w:hAnsi="Times New Roman" w:cs="Times New Roman"/>
+          <w:color w:val="000000" w:themeColor="text1"/>
+        </w:rPr>
+        <w:t>The only values that will be returned will be exceptions thrown during error checking, i.e.  missing required data</w:t>
+      </w:r>
+    </w:p>
+    <w:p>
+      <w:pPr>
+        <w:spacing w:line="480" w:lineRule="auto"/>
+        <w:rPr>
+          <w:rFonts w:ascii="Times New Roman" w:hAnsi="Times New Roman" w:cs="Times New Roman"/>
+          <w:color w:val="000000" w:themeColor="text1"/>
+        </w:rPr>
+      </w:pPr>
+      <w:r>
+        <w:rPr>
+          <w:rFonts w:ascii="Times New Roman" w:hAnsi="Times New Roman" w:cs="Times New Roman"/>
+          <w:b/>
+          <w:bCs/>
+          <w:color w:val="000000" w:themeColor="text1"/>
+        </w:rPr>
+        <w:tab/>
+        <w:t xml:space="preserve">Types: </w:t>
+      </w:r>
+      <w:r>
+        <w:rPr>
+          <w:rFonts w:ascii="Times New Roman" w:hAnsi="Times New Roman" w:cs="Times New Roman"/>
+          <w:color w:val="000000" w:themeColor="text1"/>
+        </w:rPr>
+        <w:t xml:space="preserve">The </w:t>
+      </w:r>
+      <w:r>
+        <w:rPr>
+          <w:rFonts w:ascii="Times New Roman" w:hAnsi="Times New Roman" w:cs="Times New Roman"/>
+          <w:color w:val="000000" w:themeColor="text1"/>
+        </w:rPr>
+        <w:t>input will be a string of the activity name they wish to delete</w:t>
+      </w:r>
+    </w:p>
+    <w:p>
+      <w:pPr>
+        <w:spacing w:line="480" w:lineRule="auto"/>
+        <w:rPr>
+          <w:rFonts w:ascii="Times New Roman" w:hAnsi="Times New Roman" w:cs="Times New Roman"/>
           <w:i/>
           <w:iCs/>
           <w:color w:val="000000" w:themeColor="text1"/>
-        </w:rPr>
-        <w:t>):</w:t>
-      </w:r>
-    </w:p>
-    <w:p>
-      <w:pPr>
-        <w:spacing w:line="480" w:lineRule="auto"/>
-        <w:rPr>
-          <w:rFonts w:ascii="Times New Roman" w:hAnsi="Times New Roman" w:cs="Times New Roman"/>
-          <w:color w:val="000000" w:themeColor="text1"/>
-        </w:rPr>
-      </w:pPr>
-      <w:r>
-        <w:rPr>
-          <w:rFonts w:ascii="Times New Roman" w:hAnsi="Times New Roman" w:cs="Times New Roman"/>
-          <w:b/>
-          <w:bCs/>
-          <w:color w:val="000000" w:themeColor="text1"/>
-        </w:rPr>
-        <w:tab/>
-        <w:t>Input:</w:t>
-      </w:r>
-      <w:r>
-        <w:rPr>
-          <w:rFonts w:ascii="Times New Roman" w:hAnsi="Times New Roman" w:cs="Times New Roman"/>
-          <w:b/>
-          <w:bCs/>
-          <w:color w:val="000000" w:themeColor="text1"/>
-        </w:rPr>
-        <w:t xml:space="preserve"> </w:t>
-      </w:r>
-      <w:r>
-        <w:rPr>
-          <w:rFonts w:ascii="Times New Roman" w:hAnsi="Times New Roman" w:cs="Times New Roman"/>
-          <w:color w:val="000000" w:themeColor="text1"/>
-        </w:rPr>
-        <w:t>The function will receive the name of the activity that the user wishes to delete</w:t>
-      </w:r>
-    </w:p>
-    <w:p>
-      <w:pPr>
-        <w:spacing w:line="480" w:lineRule="auto"/>
-        <w:ind w:left="720"/>
-        <w:rPr>
-          <w:rFonts w:ascii="Times New Roman" w:hAnsi="Times New Roman" w:cs="Times New Roman"/>
-          <w:color w:val="000000" w:themeColor="text1"/>
-        </w:rPr>
-      </w:pPr>
-      <w:r>
-        <w:rPr>
-          <w:rFonts w:ascii="Times New Roman" w:hAnsi="Times New Roman" w:cs="Times New Roman"/>
-          <w:b/>
-          <w:bCs/>
-          <w:color w:val="000000" w:themeColor="text1"/>
-        </w:rPr>
-        <w:t xml:space="preserve">Output: </w:t>
-      </w:r>
-      <w:r>
-        <w:rPr>
-          <w:rFonts w:ascii="Times New Roman" w:hAnsi="Times New Roman" w:cs="Times New Roman"/>
-          <w:color w:val="000000" w:themeColor="text1"/>
-        </w:rPr>
-        <w:t xml:space="preserve">The function will output a success or error message depending on </w:t>
-      </w:r>
-      <w:proofErr w:type="gramStart"/>
-      <w:r>
-        <w:rPr>
-          <w:rFonts w:ascii="Times New Roman" w:hAnsi="Times New Roman" w:cs="Times New Roman"/>
-          <w:color w:val="000000" w:themeColor="text1"/>
-        </w:rPr>
-        <w:t>whether or not</w:t>
-      </w:r>
-      <w:proofErr w:type="gramEnd"/>
-      <w:r>
-        <w:rPr>
-          <w:rFonts w:ascii="Times New Roman" w:hAnsi="Times New Roman" w:cs="Times New Roman"/>
-          <w:color w:val="000000" w:themeColor="text1"/>
-        </w:rPr>
-        <w:t xml:space="preserve"> the user enters all required data</w:t>
-      </w:r>
-    </w:p>
-    <w:p>
-      <w:pPr>
-        <w:spacing w:line="480" w:lineRule="auto"/>
-        <w:ind w:left="720"/>
-        <w:rPr>
-          <w:rFonts w:ascii="Times New Roman" w:hAnsi="Times New Roman" w:cs="Times New Roman"/>
-          <w:color w:val="000000" w:themeColor="text1"/>
-        </w:rPr>
-      </w:pPr>
-      <w:r>
-        <w:rPr>
-          <w:rFonts w:ascii="Times New Roman" w:hAnsi="Times New Roman" w:cs="Times New Roman"/>
-          <w:b/>
-          <w:bCs/>
-          <w:color w:val="000000" w:themeColor="text1"/>
-        </w:rPr>
-        <w:t xml:space="preserve">Return Parameters: </w:t>
-      </w:r>
-      <w:r>
-        <w:rPr>
-          <w:rFonts w:ascii="Times New Roman" w:hAnsi="Times New Roman" w:cs="Times New Roman"/>
-          <w:color w:val="000000" w:themeColor="text1"/>
-        </w:rPr>
-        <w:t>The only values that will be returned will be exceptions thrown during error checking, i.e.  missing required data</w:t>
-      </w:r>
-    </w:p>
-    <w:p>
-      <w:pPr>
-        <w:spacing w:line="480" w:lineRule="auto"/>
-        <w:rPr>
-          <w:rFonts w:ascii="Times New Roman" w:hAnsi="Times New Roman" w:cs="Times New Roman"/>
-          <w:color w:val="000000" w:themeColor="text1"/>
-        </w:rPr>
-      </w:pPr>
-      <w:r>
-        <w:rPr>
-          <w:rFonts w:ascii="Times New Roman" w:hAnsi="Times New Roman" w:cs="Times New Roman"/>
-          <w:b/>
-          <w:bCs/>
-          <w:color w:val="000000" w:themeColor="text1"/>
-        </w:rPr>
-        <w:tab/>
-        <w:t xml:space="preserve">Types: </w:t>
-      </w:r>
-      <w:r>
-        <w:rPr>
-          <w:rFonts w:ascii="Times New Roman" w:hAnsi="Times New Roman" w:cs="Times New Roman"/>
-          <w:color w:val="000000" w:themeColor="text1"/>
-        </w:rPr>
-        <w:t xml:space="preserve">The </w:t>
-      </w:r>
-      <w:r>
-        <w:rPr>
-          <w:rFonts w:ascii="Times New Roman" w:hAnsi="Times New Roman" w:cs="Times New Roman"/>
-          <w:color w:val="000000" w:themeColor="text1"/>
-        </w:rPr>
-        <w:t>input will be a string of the activity name they wish to delete</w:t>
-      </w:r>
-    </w:p>
-    <w:p>
-      <w:pPr>
-        <w:spacing w:line="480" w:lineRule="auto"/>
+          <w:u w:val="single"/>
+        </w:rPr>
+      </w:pPr>
+      <w:r>
         <w:rPr>
           <w:rFonts w:ascii="Times New Roman" w:hAnsi="Times New Roman" w:cs="Times New Roman"/>
           <w:i/>
@@ -9396,37 +9023,223 @@
           <w:color w:val="000000" w:themeColor="text1"/>
           <w:u w:val="single"/>
         </w:rPr>
-      </w:pPr>
-      <w:r>
-        <w:rPr>
-          <w:rFonts w:ascii="Times New Roman" w:hAnsi="Times New Roman" w:cs="Times New Roman"/>
+        <w:t>Group Class</w:t>
+      </w:r>
+    </w:p>
+    <w:p>
+      <w:pPr>
+        <w:spacing w:line="480" w:lineRule="auto"/>
+        <w:rPr>
+          <w:rFonts w:ascii="Times New Roman" w:hAnsi="Times New Roman" w:cs="Times New Roman"/>
+        </w:rPr>
+      </w:pPr>
+      <w:r>
+        <w:rPr>
+          <w:rFonts w:ascii="Times New Roman" w:hAnsi="Times New Roman" w:cs="Times New Roman"/>
+          <w:b/>
+          <w:bCs/>
           <w:i/>
           <w:iCs/>
-          <w:color w:val="000000" w:themeColor="text1"/>
-          <w:u w:val="single"/>
-        </w:rPr>
-        <w:t>Group Class</w:t>
-      </w:r>
-    </w:p>
-    <w:p>
-      <w:pPr>
-        <w:spacing w:line="480" w:lineRule="auto"/>
-        <w:rPr>
-          <w:rFonts w:ascii="Times New Roman" w:hAnsi="Times New Roman" w:cs="Times New Roman"/>
-        </w:rPr>
-      </w:pPr>
-      <w:proofErr w:type="gramStart"/>
-      <w:r>
-        <w:rPr>
-          <w:rFonts w:ascii="Times New Roman" w:hAnsi="Times New Roman" w:cs="Times New Roman"/>
-          <w:b/>
-          <w:bCs/>
+        </w:rPr>
+        <w:t>CreateGroup()</w:t>
+      </w:r>
+      <w:r>
+        <w:rPr>
+          <w:rFonts w:ascii="Times New Roman" w:hAnsi="Times New Roman" w:cs="Times New Roman"/>
           <w:i/>
           <w:iCs/>
         </w:rPr>
-        <w:t>CreateGroup(</w:t>
+        <w:t>:</w:t>
+      </w:r>
+      <w:r>
+        <w:rPr>
+          <w:rFonts w:ascii="Times New Roman" w:hAnsi="Times New Roman" w:cs="Times New Roman"/>
+        </w:rPr>
+        <w:t xml:space="preserve"> Creates new group and makes creator the administrator of group</w:t>
+      </w:r>
+    </w:p>
+    <w:p>
+      <w:pPr>
+        <w:spacing w:line="480" w:lineRule="auto"/>
+        <w:ind w:left="720"/>
+        <w:rPr>
+          <w:rFonts w:ascii="Times New Roman" w:hAnsi="Times New Roman" w:cs="Times New Roman"/>
+        </w:rPr>
+      </w:pPr>
+      <w:r>
+        <w:rPr>
+          <w:rFonts w:ascii="Times New Roman" w:hAnsi="Times New Roman" w:cs="Times New Roman"/>
+          <w:b/>
+          <w:bCs/>
+        </w:rPr>
+        <w:t>Input:</w:t>
+      </w:r>
+      <w:r>
+        <w:rPr>
+          <w:rFonts w:ascii="Times New Roman" w:hAnsi="Times New Roman" w:cs="Times New Roman"/>
+          <w:b/>
+          <w:bCs/>
+        </w:rPr>
+        <w:t xml:space="preserve"> </w:t>
+      </w:r>
+      <w:r>
+        <w:rPr>
+          <w:rFonts w:ascii="Times New Roman" w:hAnsi="Times New Roman" w:cs="Times New Roman"/>
+        </w:rPr>
+        <w:t xml:space="preserve">Input will consist of group information, such as name, type of group, </w:t>
+      </w:r>
+      <w:r>
+        <w:rPr>
+          <w:rFonts w:ascii="Times New Roman" w:hAnsi="Times New Roman" w:cs="Times New Roman"/>
+        </w:rPr>
+        <w:t xml:space="preserve">whether the group is private, </w:t>
+      </w:r>
+      <w:r>
+        <w:rPr>
+          <w:rFonts w:ascii="Times New Roman" w:hAnsi="Times New Roman" w:cs="Times New Roman"/>
+        </w:rPr>
+        <w:t>and</w:t>
+      </w:r>
+      <w:r>
+        <w:rPr>
+          <w:rFonts w:ascii="Times New Roman" w:hAnsi="Times New Roman" w:cs="Times New Roman"/>
+        </w:rPr>
+        <w:t xml:space="preserve"> </w:t>
+      </w:r>
+      <w:r>
+        <w:rPr>
+          <w:rFonts w:ascii="Times New Roman" w:hAnsi="Times New Roman" w:cs="Times New Roman"/>
+        </w:rPr>
+        <w:t xml:space="preserve">a </w:t>
+      </w:r>
+      <w:r>
+        <w:rPr>
+          <w:rFonts w:ascii="Times New Roman" w:hAnsi="Times New Roman" w:cs="Times New Roman"/>
+        </w:rPr>
+        <w:t>designated administrator</w:t>
+      </w:r>
+    </w:p>
+    <w:p>
+      <w:pPr>
+        <w:spacing w:line="480" w:lineRule="auto"/>
+        <w:ind w:left="720"/>
+        <w:rPr>
+          <w:rFonts w:ascii="Times New Roman" w:hAnsi="Times New Roman" w:cs="Times New Roman"/>
+        </w:rPr>
+      </w:pPr>
+      <w:r>
+        <w:rPr>
+          <w:rFonts w:ascii="Times New Roman" w:hAnsi="Times New Roman" w:cs="Times New Roman"/>
+          <w:b/>
+          <w:bCs/>
+        </w:rPr>
+        <w:t>Output:</w:t>
+      </w:r>
+      <w:r>
+        <w:rPr>
+          <w:rFonts w:ascii="Times New Roman" w:hAnsi="Times New Roman" w:cs="Times New Roman"/>
+          <w:b/>
+          <w:bCs/>
+        </w:rPr>
+        <w:t xml:space="preserve"> </w:t>
+      </w:r>
+      <w:r>
+        <w:rPr>
+          <w:rFonts w:ascii="Times New Roman" w:hAnsi="Times New Roman" w:cs="Times New Roman"/>
+        </w:rPr>
+        <w:t xml:space="preserve">The function will output a success or error message depending on </w:t>
+      </w:r>
+      <w:proofErr w:type="gramStart"/>
+      <w:r>
+        <w:rPr>
+          <w:rFonts w:ascii="Times New Roman" w:hAnsi="Times New Roman" w:cs="Times New Roman"/>
+        </w:rPr>
+        <w:t>whether or not</w:t>
       </w:r>
       <w:proofErr w:type="gramEnd"/>
+      <w:r>
+        <w:rPr>
+          <w:rFonts w:ascii="Times New Roman" w:hAnsi="Times New Roman" w:cs="Times New Roman"/>
+        </w:rPr>
+        <w:t xml:space="preserve"> the user enters all required data</w:t>
+      </w:r>
+    </w:p>
+    <w:p>
+      <w:pPr>
+        <w:spacing w:line="480" w:lineRule="auto"/>
+        <w:ind w:left="720"/>
+        <w:rPr>
+          <w:rFonts w:ascii="Times New Roman" w:hAnsi="Times New Roman" w:cs="Times New Roman"/>
+        </w:rPr>
+      </w:pPr>
+      <w:r>
+        <w:rPr>
+          <w:rFonts w:ascii="Times New Roman" w:hAnsi="Times New Roman" w:cs="Times New Roman"/>
+          <w:b/>
+          <w:bCs/>
+        </w:rPr>
+        <w:t>Return Parameters:</w:t>
+      </w:r>
+      <w:r>
+        <w:rPr>
+          <w:rFonts w:ascii="Times New Roman" w:hAnsi="Times New Roman" w:cs="Times New Roman"/>
+          <w:b/>
+          <w:bCs/>
+        </w:rPr>
+        <w:t xml:space="preserve"> </w:t>
+      </w:r>
+      <w:r>
+        <w:rPr>
+          <w:rFonts w:ascii="Times New Roman" w:hAnsi="Times New Roman" w:cs="Times New Roman"/>
+        </w:rPr>
+        <w:t>The only values that will be returned will be exceptions thrown during error checking, i.e. missing required data</w:t>
+      </w:r>
+    </w:p>
+    <w:p>
+      <w:pPr>
+        <w:spacing w:line="480" w:lineRule="auto"/>
+        <w:ind w:left="720"/>
+        <w:rPr>
+          <w:rFonts w:ascii="Times New Roman" w:hAnsi="Times New Roman" w:cs="Times New Roman"/>
+        </w:rPr>
+      </w:pPr>
+      <w:r>
+        <w:rPr>
+          <w:rFonts w:ascii="Times New Roman" w:hAnsi="Times New Roman" w:cs="Times New Roman"/>
+          <w:b/>
+          <w:bCs/>
+        </w:rPr>
+        <w:lastRenderedPageBreak/>
+        <w:t>Type:</w:t>
+      </w:r>
+      <w:r>
+        <w:rPr>
+          <w:rFonts w:ascii="Times New Roman" w:hAnsi="Times New Roman" w:cs="Times New Roman"/>
+          <w:b/>
+          <w:bCs/>
+        </w:rPr>
+        <w:t xml:space="preserve"> </w:t>
+      </w:r>
+      <w:r>
+        <w:rPr>
+          <w:rFonts w:ascii="Times New Roman" w:hAnsi="Times New Roman" w:cs="Times New Roman"/>
+        </w:rPr>
+        <w:t>The input will consist of strings</w:t>
+      </w:r>
+      <w:r>
+        <w:rPr>
+          <w:rFonts w:ascii="Times New Roman" w:hAnsi="Times New Roman" w:cs="Times New Roman"/>
+        </w:rPr>
+        <w:t xml:space="preserve"> for each field of information required to create a group</w:t>
+      </w:r>
+    </w:p>
+    <w:p>
+      <w:pPr>
+        <w:spacing w:line="480" w:lineRule="auto"/>
+        <w:rPr>
+          <w:rFonts w:ascii="Times New Roman" w:hAnsi="Times New Roman" w:cs="Times New Roman"/>
+        </w:rPr>
+      </w:pPr>
       <w:r>
         <w:rPr>
           <w:rFonts w:ascii="Times New Roman" w:hAnsi="Times New Roman" w:cs="Times New Roman"/>
@@ -9435,21 +9248,206 @@
           <w:i/>
           <w:iCs/>
         </w:rPr>
-        <w:t>)</w:t>
-      </w:r>
-      <w:r>
-        <w:rPr>
-          <w:rFonts w:ascii="Times New Roman" w:hAnsi="Times New Roman" w:cs="Times New Roman"/>
+        <w:t>RequestToJoin()</w:t>
+      </w:r>
+      <w:r>
+        <w:rPr>
+          <w:rFonts w:ascii="Times New Roman" w:hAnsi="Times New Roman" w:cs="Times New Roman"/>
+        </w:rPr>
+        <w:t xml:space="preserve"> – Sends a request to join to an admin</w:t>
+      </w:r>
+    </w:p>
+    <w:p>
+      <w:pPr>
+        <w:spacing w:line="480" w:lineRule="auto"/>
+        <w:ind w:left="720"/>
+        <w:rPr>
+          <w:rFonts w:ascii="Times New Roman" w:hAnsi="Times New Roman" w:cs="Times New Roman"/>
+        </w:rPr>
+      </w:pPr>
+      <w:r>
+        <w:rPr>
+          <w:rFonts w:ascii="Times New Roman" w:hAnsi="Times New Roman" w:cs="Times New Roman"/>
+          <w:b/>
+          <w:bCs/>
+        </w:rPr>
+        <w:t>Input:</w:t>
+      </w:r>
+      <w:r>
+        <w:rPr>
+          <w:rFonts w:ascii="Times New Roman" w:hAnsi="Times New Roman" w:cs="Times New Roman"/>
+          <w:b/>
+          <w:bCs/>
+        </w:rPr>
+        <w:t xml:space="preserve"> </w:t>
+      </w:r>
+      <w:r>
+        <w:rPr>
+          <w:rFonts w:ascii="Times New Roman" w:hAnsi="Times New Roman" w:cs="Times New Roman"/>
+        </w:rPr>
+        <w:t xml:space="preserve">There will be </w:t>
+      </w:r>
+      <w:proofErr w:type="gramStart"/>
+      <w:r>
+        <w:rPr>
+          <w:rFonts w:ascii="Times New Roman" w:hAnsi="Times New Roman" w:cs="Times New Roman"/>
+        </w:rPr>
+        <w:t>a</w:t>
+      </w:r>
+      <w:proofErr w:type="gramEnd"/>
+      <w:r>
+        <w:rPr>
+          <w:rFonts w:ascii="Times New Roman" w:hAnsi="Times New Roman" w:cs="Times New Roman"/>
+        </w:rPr>
+        <w:t xml:space="preserve"> optional input, which will be the user’s reason as to why they would like to join the group</w:t>
+      </w:r>
+      <w:r>
+        <w:rPr>
+          <w:rFonts w:ascii="Times New Roman" w:hAnsi="Times New Roman" w:cs="Times New Roman"/>
+        </w:rPr>
+        <w:t xml:space="preserve">. The user will have to enter their username that goes along with the </w:t>
+      </w:r>
+      <w:r>
+        <w:rPr>
+          <w:rFonts w:ascii="Times New Roman" w:hAnsi="Times New Roman" w:cs="Times New Roman"/>
+        </w:rPr>
+        <w:t>request</w:t>
+      </w:r>
+    </w:p>
+    <w:p>
+      <w:pPr>
+        <w:spacing w:line="480" w:lineRule="auto"/>
+        <w:ind w:left="720"/>
+        <w:rPr>
+          <w:rFonts w:ascii="Times New Roman" w:hAnsi="Times New Roman" w:cs="Times New Roman"/>
+        </w:rPr>
+      </w:pPr>
+      <w:r>
+        <w:rPr>
+          <w:rFonts w:ascii="Times New Roman" w:hAnsi="Times New Roman" w:cs="Times New Roman"/>
+          <w:b/>
+          <w:bCs/>
+        </w:rPr>
+        <w:t>Output:</w:t>
+      </w:r>
+      <w:r>
+        <w:rPr>
+          <w:rFonts w:ascii="Times New Roman" w:hAnsi="Times New Roman" w:cs="Times New Roman"/>
+          <w:b/>
+          <w:bCs/>
+        </w:rPr>
+        <w:t xml:space="preserve"> </w:t>
+      </w:r>
+      <w:r>
+        <w:rPr>
+          <w:rFonts w:ascii="Times New Roman" w:hAnsi="Times New Roman" w:cs="Times New Roman"/>
+        </w:rPr>
+        <w:t>A message will be displayed saying the request has been sent for review by an administrator of the group</w:t>
+      </w:r>
+    </w:p>
+    <w:p>
+      <w:pPr>
+        <w:spacing w:line="480" w:lineRule="auto"/>
+        <w:ind w:left="720"/>
+        <w:rPr>
+          <w:rFonts w:ascii="Times New Roman" w:hAnsi="Times New Roman" w:cs="Times New Roman"/>
+        </w:rPr>
+      </w:pPr>
+      <w:r>
+        <w:rPr>
+          <w:rFonts w:ascii="Times New Roman" w:hAnsi="Times New Roman" w:cs="Times New Roman"/>
+          <w:b/>
+          <w:bCs/>
+        </w:rPr>
+        <w:t>Return Parameters:</w:t>
+      </w:r>
+      <w:r>
+        <w:rPr>
+          <w:rFonts w:ascii="Times New Roman" w:hAnsi="Times New Roman" w:cs="Times New Roman"/>
+          <w:b/>
+          <w:bCs/>
+        </w:rPr>
+        <w:t xml:space="preserve"> </w:t>
+      </w:r>
+      <w:r>
+        <w:rPr>
+          <w:rFonts w:ascii="Times New Roman" w:hAnsi="Times New Roman" w:cs="Times New Roman"/>
+        </w:rPr>
+        <w:t xml:space="preserve">The only values that will be returned </w:t>
+      </w:r>
+      <w:r>
+        <w:rPr>
+          <w:rFonts w:ascii="Times New Roman" w:hAnsi="Times New Roman" w:cs="Times New Roman"/>
+        </w:rPr>
+        <w:t>will be exceptions thrown during sending of the request, which in this case could be a database error</w:t>
+      </w:r>
+      <w:r>
+        <w:rPr>
+          <w:rFonts w:ascii="Times New Roman" w:hAnsi="Times New Roman" w:cs="Times New Roman"/>
+        </w:rPr>
+        <w:t xml:space="preserve"> or an error checking exception of the user not entering their username.</w:t>
+      </w:r>
+    </w:p>
+    <w:p>
+      <w:pPr>
+        <w:spacing w:line="480" w:lineRule="auto"/>
+        <w:ind w:left="360"/>
+        <w:rPr>
+          <w:rFonts w:ascii="Times New Roman" w:hAnsi="Times New Roman" w:cs="Times New Roman"/>
+        </w:rPr>
+      </w:pPr>
+      <w:r>
+        <w:rPr>
+          <w:rFonts w:ascii="Times New Roman" w:hAnsi="Times New Roman" w:cs="Times New Roman"/>
+          <w:b/>
+          <w:bCs/>
+        </w:rPr>
+        <w:tab/>
+        <w:t>Type:</w:t>
+      </w:r>
+      <w:r>
+        <w:rPr>
+          <w:rFonts w:ascii="Times New Roman" w:hAnsi="Times New Roman" w:cs="Times New Roman"/>
+          <w:b/>
+          <w:bCs/>
+        </w:rPr>
+        <w:t xml:space="preserve"> </w:t>
+      </w:r>
+      <w:r>
+        <w:rPr>
+          <w:rFonts w:ascii="Times New Roman" w:hAnsi="Times New Roman" w:cs="Times New Roman"/>
+        </w:rPr>
+        <w:t>Optional input will be a string</w:t>
+      </w:r>
+      <w:r>
+        <w:rPr>
+          <w:rFonts w:ascii="Times New Roman" w:hAnsi="Times New Roman" w:cs="Times New Roman"/>
+        </w:rPr>
+        <w:t>, user’s username will be extracted as a string</w:t>
+      </w:r>
+    </w:p>
+    <w:p>
+      <w:pPr>
+        <w:spacing w:line="480" w:lineRule="auto"/>
+        <w:rPr>
+          <w:rFonts w:ascii="Times New Roman" w:hAnsi="Times New Roman" w:cs="Times New Roman"/>
+        </w:rPr>
+      </w:pPr>
+      <w:r>
+        <w:rPr>
+          <w:rFonts w:ascii="Times New Roman" w:hAnsi="Times New Roman" w:cs="Times New Roman"/>
+          <w:b/>
+          <w:bCs/>
           <w:i/>
           <w:iCs/>
         </w:rPr>
-        <w:t>:</w:t>
-      </w:r>
-      <w:r>
-        <w:rPr>
-          <w:rFonts w:ascii="Times New Roman" w:hAnsi="Times New Roman" w:cs="Times New Roman"/>
-        </w:rPr>
-        <w:t xml:space="preserve"> Creates new group and makes creator the administrator of group</w:t>
+        <w:t>ApproveMember()</w:t>
+      </w:r>
+      <w:r>
+        <w:rPr>
+          <w:rFonts w:ascii="Times New Roman" w:hAnsi="Times New Roman" w:cs="Times New Roman"/>
+        </w:rPr>
+        <w:t xml:space="preserve"> – Admin approved member request</w:t>
       </w:r>
     </w:p>
     <w:p>
@@ -9480,23 +9478,48 @@
         <w:rPr>
           <w:rFonts w:ascii="Times New Roman" w:hAnsi="Times New Roman" w:cs="Times New Roman"/>
         </w:rPr>
-        <w:t xml:space="preserve">Input will consist of group information, such as name, type of group, </w:t>
-      </w:r>
-      <w:r>
-        <w:rPr>
-          <w:rFonts w:ascii="Times New Roman" w:hAnsi="Times New Roman" w:cs="Times New Roman"/>
-        </w:rPr>
-        <w:t xml:space="preserve">whether the group is private, </w:t>
-      </w:r>
-      <w:r>
-        <w:rPr>
-          <w:rFonts w:ascii="Times New Roman" w:hAnsi="Times New Roman" w:cs="Times New Roman"/>
-        </w:rPr>
-        <w:t>and</w:t>
-      </w:r>
-      <w:r>
-        <w:rPr>
-          <w:rFonts w:ascii="Times New Roman" w:hAnsi="Times New Roman" w:cs="Times New Roman"/>
+        <w:t xml:space="preserve">The function will take in </w:t>
+      </w:r>
+      <w:r>
+        <w:rPr>
+          <w:rFonts w:ascii="Times New Roman" w:hAnsi="Times New Roman" w:cs="Times New Roman"/>
+        </w:rPr>
+        <w:t xml:space="preserve">the </w:t>
+      </w:r>
+      <w:r>
+        <w:rPr>
+          <w:rFonts w:ascii="Times New Roman" w:hAnsi="Times New Roman" w:cs="Times New Roman"/>
+        </w:rPr>
+        <w:t>admin’s answer to the request</w:t>
+      </w:r>
+      <w:r>
+        <w:rPr>
+          <w:rFonts w:ascii="Times New Roman" w:hAnsi="Times New Roman" w:cs="Times New Roman"/>
+        </w:rPr>
+        <w:t>, which will be to approve or to deny access</w:t>
+      </w:r>
+    </w:p>
+    <w:p>
+      <w:pPr>
+        <w:spacing w:line="480" w:lineRule="auto"/>
+        <w:ind w:left="720"/>
+        <w:rPr>
+          <w:rFonts w:ascii="Times New Roman" w:hAnsi="Times New Roman" w:cs="Times New Roman"/>
+        </w:rPr>
+      </w:pPr>
+      <w:r>
+        <w:rPr>
+          <w:rFonts w:ascii="Times New Roman" w:hAnsi="Times New Roman" w:cs="Times New Roman"/>
+          <w:b/>
+          <w:bCs/>
+        </w:rPr>
+        <w:t>Output:</w:t>
+      </w:r>
+      <w:r>
+        <w:rPr>
+          <w:rFonts w:ascii="Times New Roman" w:hAnsi="Times New Roman" w:cs="Times New Roman"/>
+          <w:b/>
+          <w:bCs/>
         </w:rPr>
         <w:t xml:space="preserve"> </w:t>
       </w:r>
@@ -9504,13 +9527,13 @@
         <w:rPr>
           <w:rFonts w:ascii="Times New Roman" w:hAnsi="Times New Roman" w:cs="Times New Roman"/>
         </w:rPr>
-        <w:t xml:space="preserve">a </w:t>
-      </w:r>
-      <w:r>
-        <w:rPr>
-          <w:rFonts w:ascii="Times New Roman" w:hAnsi="Times New Roman" w:cs="Times New Roman"/>
-        </w:rPr>
-        <w:t>designated administrator</w:t>
+        <w:t>The function will output a message depending on admin’s answer to the request</w:t>
+      </w:r>
+      <w:r>
+        <w:rPr>
+          <w:rFonts w:ascii="Times New Roman" w:hAnsi="Times New Roman" w:cs="Times New Roman"/>
+        </w:rPr>
+        <w:t>, if the admin approves the request, the user will be added to the group. If the admin denies the request, a message will be sent to the user denied.</w:t>
       </w:r>
     </w:p>
     <w:p>
@@ -9527,48 +9550,11 @@
           <w:b/>
           <w:bCs/>
         </w:rPr>
-        <w:t>Output:</w:t>
-      </w:r>
-      <w:r>
-        <w:rPr>
-          <w:rFonts w:ascii="Times New Roman" w:hAnsi="Times New Roman" w:cs="Times New Roman"/>
-          <w:b/>
-          <w:bCs/>
-        </w:rPr>
         <w:t xml:space="preserve"> </w:t>
       </w:r>
       <w:r>
         <w:rPr>
           <w:rFonts w:ascii="Times New Roman" w:hAnsi="Times New Roman" w:cs="Times New Roman"/>
-        </w:rPr>
-        <w:t xml:space="preserve">The function will output a success or error message depending on </w:t>
-      </w:r>
-      <w:proofErr w:type="gramStart"/>
-      <w:r>
-        <w:rPr>
-          <w:rFonts w:ascii="Times New Roman" w:hAnsi="Times New Roman" w:cs="Times New Roman"/>
-        </w:rPr>
-        <w:t>whether or not</w:t>
-      </w:r>
-      <w:proofErr w:type="gramEnd"/>
-      <w:r>
-        <w:rPr>
-          <w:rFonts w:ascii="Times New Roman" w:hAnsi="Times New Roman" w:cs="Times New Roman"/>
-        </w:rPr>
-        <w:t xml:space="preserve"> the user enters all required data</w:t>
-      </w:r>
-    </w:p>
-    <w:p>
-      <w:pPr>
-        <w:spacing w:line="480" w:lineRule="auto"/>
-        <w:ind w:left="720"/>
-        <w:rPr>
-          <w:rFonts w:ascii="Times New Roman" w:hAnsi="Times New Roman" w:cs="Times New Roman"/>
-        </w:rPr>
-      </w:pPr>
-      <w:r>
-        <w:rPr>
-          <w:rFonts w:ascii="Times New Roman" w:hAnsi="Times New Roman" w:cs="Times New Roman"/>
           <w:b/>
           <w:bCs/>
         </w:rPr>
@@ -9586,7 +9572,43 @@
         <w:rPr>
           <w:rFonts w:ascii="Times New Roman" w:hAnsi="Times New Roman" w:cs="Times New Roman"/>
         </w:rPr>
-        <w:t>The only values that will be returned will be exceptions thrown during error checking, i.e. missing required data</w:t>
+        <w:t xml:space="preserve">The values returned will be </w:t>
+      </w:r>
+      <w:r>
+        <w:rPr>
+          <w:rFonts w:ascii="Times New Roman" w:hAnsi="Times New Roman" w:cs="Times New Roman"/>
+        </w:rPr>
+        <w:t xml:space="preserve">the </w:t>
+      </w:r>
+      <w:r>
+        <w:rPr>
+          <w:rFonts w:ascii="Times New Roman" w:hAnsi="Times New Roman" w:cs="Times New Roman"/>
+        </w:rPr>
+        <w:t xml:space="preserve">messages returned during error </w:t>
+      </w:r>
+      <w:r>
+        <w:rPr>
+          <w:rFonts w:ascii="Times New Roman" w:hAnsi="Times New Roman" w:cs="Times New Roman"/>
+        </w:rPr>
+        <w:t xml:space="preserve">   </w:t>
+      </w:r>
+      <w:r>
+        <w:rPr>
+          <w:rFonts w:ascii="Times New Roman" w:hAnsi="Times New Roman" w:cs="Times New Roman"/>
+        </w:rPr>
+        <w:t xml:space="preserve">exceptions, </w:t>
+      </w:r>
+      <w:r>
+        <w:rPr>
+          <w:rFonts w:ascii="Times New Roman" w:hAnsi="Times New Roman" w:cs="Times New Roman"/>
+        </w:rPr>
+        <w:t>which could be an error in adding the user to the</w:t>
+      </w:r>
+      <w:r>
+        <w:rPr>
+          <w:rFonts w:ascii="Times New Roman" w:hAnsi="Times New Roman" w:cs="Times New Roman"/>
+        </w:rPr>
+        <w:t xml:space="preserve"> group</w:t>
       </w:r>
     </w:p>
     <w:p>
@@ -9618,23 +9640,16 @@
         <w:rPr>
           <w:rFonts w:ascii="Times New Roman" w:hAnsi="Times New Roman" w:cs="Times New Roman"/>
         </w:rPr>
-        <w:t>The input will consist of strings</w:t>
-      </w:r>
-      <w:r>
-        <w:rPr>
-          <w:rFonts w:ascii="Times New Roman" w:hAnsi="Times New Roman" w:cs="Times New Roman"/>
-        </w:rPr>
-        <w:t xml:space="preserve"> for each field of information required to create a group</w:t>
-      </w:r>
-    </w:p>
-    <w:p>
-      <w:pPr>
-        <w:spacing w:line="480" w:lineRule="auto"/>
-        <w:rPr>
-          <w:rFonts w:ascii="Times New Roman" w:hAnsi="Times New Roman" w:cs="Times New Roman"/>
-        </w:rPr>
-      </w:pPr>
-      <w:proofErr w:type="gramStart"/>
+        <w:t>The input will be a flag sent to the program based on the admin’s response to the request</w:t>
+      </w:r>
+    </w:p>
+    <w:p>
+      <w:pPr>
+        <w:spacing w:line="480" w:lineRule="auto"/>
+        <w:rPr>
+          <w:rFonts w:ascii="Times New Roman" w:hAnsi="Times New Roman" w:cs="Times New Roman"/>
+        </w:rPr>
+      </w:pPr>
       <w:r>
         <w:rPr>
           <w:rFonts w:ascii="Times New Roman" w:hAnsi="Times New Roman" w:cs="Times New Roman"/>
@@ -9643,9 +9658,147 @@
           <w:i/>
           <w:iCs/>
         </w:rPr>
-        <w:t>RequestToJoin(</w:t>
-      </w:r>
-      <w:proofErr w:type="gramEnd"/>
+        <w:t>RemoveMember()</w:t>
+      </w:r>
+      <w:r>
+        <w:rPr>
+          <w:rFonts w:ascii="Times New Roman" w:hAnsi="Times New Roman" w:cs="Times New Roman"/>
+        </w:rPr>
+        <w:t xml:space="preserve"> – Admin removes user from group</w:t>
+      </w:r>
+    </w:p>
+    <w:p>
+      <w:pPr>
+        <w:spacing w:line="480" w:lineRule="auto"/>
+        <w:ind w:left="720"/>
+        <w:rPr>
+          <w:rFonts w:ascii="Times New Roman" w:hAnsi="Times New Roman" w:cs="Times New Roman"/>
+        </w:rPr>
+      </w:pPr>
+      <w:r>
+        <w:rPr>
+          <w:rFonts w:ascii="Times New Roman" w:hAnsi="Times New Roman" w:cs="Times New Roman"/>
+          <w:b/>
+          <w:bCs/>
+        </w:rPr>
+        <w:t>Input:</w:t>
+      </w:r>
+      <w:r>
+        <w:rPr>
+          <w:rFonts w:ascii="Times New Roman" w:hAnsi="Times New Roman" w:cs="Times New Roman"/>
+          <w:b/>
+          <w:bCs/>
+        </w:rPr>
+        <w:t xml:space="preserve"> </w:t>
+      </w:r>
+      <w:r>
+        <w:rPr>
+          <w:rFonts w:ascii="Times New Roman" w:hAnsi="Times New Roman" w:cs="Times New Roman"/>
+        </w:rPr>
+        <w:t>Function will receive the username or name of the member to be removed from the group</w:t>
+      </w:r>
+    </w:p>
+    <w:p>
+      <w:pPr>
+        <w:spacing w:line="480" w:lineRule="auto"/>
+        <w:ind w:left="720"/>
+        <w:rPr>
+          <w:rFonts w:ascii="Times New Roman" w:hAnsi="Times New Roman" w:cs="Times New Roman"/>
+        </w:rPr>
+      </w:pPr>
+      <w:r>
+        <w:rPr>
+          <w:rFonts w:ascii="Times New Roman" w:hAnsi="Times New Roman" w:cs="Times New Roman"/>
+          <w:b/>
+          <w:bCs/>
+        </w:rPr>
+        <w:t>Output:</w:t>
+      </w:r>
+      <w:r>
+        <w:rPr>
+          <w:rFonts w:ascii="Times New Roman" w:hAnsi="Times New Roman" w:cs="Times New Roman"/>
+          <w:b/>
+          <w:bCs/>
+        </w:rPr>
+        <w:t xml:space="preserve"> </w:t>
+      </w:r>
+      <w:r>
+        <w:rPr>
+          <w:rFonts w:ascii="Times New Roman" w:hAnsi="Times New Roman" w:cs="Times New Roman"/>
+        </w:rPr>
+        <w:t>Message of success will be displayed when the desired member is successfully removed from the group</w:t>
+      </w:r>
+    </w:p>
+    <w:p>
+      <w:pPr>
+        <w:spacing w:line="480" w:lineRule="auto"/>
+        <w:ind w:left="720"/>
+        <w:rPr>
+          <w:rFonts w:ascii="Times New Roman" w:hAnsi="Times New Roman" w:cs="Times New Roman"/>
+        </w:rPr>
+      </w:pPr>
+      <w:r>
+        <w:rPr>
+          <w:rFonts w:ascii="Times New Roman" w:hAnsi="Times New Roman" w:cs="Times New Roman"/>
+          <w:b/>
+          <w:bCs/>
+        </w:rPr>
+        <w:t>Return Parameters:</w:t>
+      </w:r>
+      <w:r>
+        <w:rPr>
+          <w:rFonts w:ascii="Times New Roman" w:hAnsi="Times New Roman" w:cs="Times New Roman"/>
+          <w:b/>
+          <w:bCs/>
+        </w:rPr>
+        <w:t xml:space="preserve"> </w:t>
+      </w:r>
+      <w:r>
+        <w:rPr>
+          <w:rFonts w:ascii="Times New Roman" w:hAnsi="Times New Roman" w:cs="Times New Roman"/>
+        </w:rPr>
+        <w:t>Values returned will be messages during error checking, which in this case could be an error in finding the member or removing the member</w:t>
+      </w:r>
+    </w:p>
+    <w:p>
+      <w:pPr>
+        <w:spacing w:line="480" w:lineRule="auto"/>
+        <w:ind w:left="360"/>
+        <w:rPr>
+          <w:rFonts w:ascii="Times New Roman" w:hAnsi="Times New Roman" w:cs="Times New Roman"/>
+        </w:rPr>
+      </w:pPr>
+      <w:r>
+        <w:rPr>
+          <w:rFonts w:ascii="Times New Roman" w:hAnsi="Times New Roman" w:cs="Times New Roman"/>
+          <w:b/>
+          <w:bCs/>
+        </w:rPr>
+        <w:tab/>
+        <w:t>Type:</w:t>
+      </w:r>
+      <w:r>
+        <w:rPr>
+          <w:rFonts w:ascii="Times New Roman" w:hAnsi="Times New Roman" w:cs="Times New Roman"/>
+          <w:b/>
+          <w:bCs/>
+        </w:rPr>
+        <w:t xml:space="preserve"> </w:t>
+      </w:r>
+      <w:r>
+        <w:rPr>
+          <w:rFonts w:ascii="Times New Roman" w:hAnsi="Times New Roman" w:cs="Times New Roman"/>
+        </w:rPr>
+        <w:t>Desired member’s username will be passed in as a string</w:t>
+      </w:r>
+    </w:p>
+    <w:p>
+      <w:pPr>
+        <w:spacing w:line="480" w:lineRule="auto"/>
+        <w:rPr>
+          <w:rFonts w:ascii="Times New Roman" w:hAnsi="Times New Roman" w:cs="Times New Roman"/>
+        </w:rPr>
+      </w:pPr>
       <w:r>
         <w:rPr>
           <w:rFonts w:ascii="Times New Roman" w:hAnsi="Times New Roman" w:cs="Times New Roman"/>
@@ -9654,602 +9807,7 @@
           <w:i/>
           <w:iCs/>
         </w:rPr>
-        <w:t>)</w:t>
-      </w:r>
-      <w:r>
-        <w:rPr>
-          <w:rFonts w:ascii="Times New Roman" w:hAnsi="Times New Roman" w:cs="Times New Roman"/>
-        </w:rPr>
-        <w:t xml:space="preserve"> – Sends a request to join to an admin</w:t>
-      </w:r>
-    </w:p>
-    <w:p>
-      <w:pPr>
-        <w:spacing w:line="480" w:lineRule="auto"/>
-        <w:ind w:left="720"/>
-        <w:rPr>
-          <w:rFonts w:ascii="Times New Roman" w:hAnsi="Times New Roman" w:cs="Times New Roman"/>
-        </w:rPr>
-      </w:pPr>
-      <w:r>
-        <w:rPr>
-          <w:rFonts w:ascii="Times New Roman" w:hAnsi="Times New Roman" w:cs="Times New Roman"/>
-          <w:b/>
-          <w:bCs/>
-        </w:rPr>
-        <w:t>Input:</w:t>
-      </w:r>
-      <w:r>
-        <w:rPr>
-          <w:rFonts w:ascii="Times New Roman" w:hAnsi="Times New Roman" w:cs="Times New Roman"/>
-          <w:b/>
-          <w:bCs/>
-        </w:rPr>
-        <w:t xml:space="preserve"> </w:t>
-      </w:r>
-      <w:r>
-        <w:rPr>
-          <w:rFonts w:ascii="Times New Roman" w:hAnsi="Times New Roman" w:cs="Times New Roman"/>
-        </w:rPr>
-        <w:t xml:space="preserve">There will be </w:t>
-      </w:r>
-      <w:proofErr w:type="gramStart"/>
-      <w:r>
-        <w:rPr>
-          <w:rFonts w:ascii="Times New Roman" w:hAnsi="Times New Roman" w:cs="Times New Roman"/>
-        </w:rPr>
-        <w:t>a</w:t>
-      </w:r>
-      <w:proofErr w:type="gramEnd"/>
-      <w:r>
-        <w:rPr>
-          <w:rFonts w:ascii="Times New Roman" w:hAnsi="Times New Roman" w:cs="Times New Roman"/>
-        </w:rPr>
-        <w:t xml:space="preserve"> optional input, which will be the user’s reason as to why they would like to join the group</w:t>
-      </w:r>
-      <w:r>
-        <w:rPr>
-          <w:rFonts w:ascii="Times New Roman" w:hAnsi="Times New Roman" w:cs="Times New Roman"/>
-        </w:rPr>
-        <w:t xml:space="preserve">. The user will have to enter their username that goes along with the </w:t>
-      </w:r>
-      <w:r>
-        <w:rPr>
-          <w:rFonts w:ascii="Times New Roman" w:hAnsi="Times New Roman" w:cs="Times New Roman"/>
-        </w:rPr>
-        <w:t>request</w:t>
-      </w:r>
-    </w:p>
-    <w:p>
-      <w:pPr>
-        <w:spacing w:line="480" w:lineRule="auto"/>
-        <w:ind w:left="720"/>
-        <w:rPr>
-          <w:rFonts w:ascii="Times New Roman" w:hAnsi="Times New Roman" w:cs="Times New Roman"/>
-        </w:rPr>
-      </w:pPr>
-      <w:r>
-        <w:rPr>
-          <w:rFonts w:ascii="Times New Roman" w:hAnsi="Times New Roman" w:cs="Times New Roman"/>
-          <w:b/>
-          <w:bCs/>
-        </w:rPr>
-        <w:t>Output:</w:t>
-      </w:r>
-      <w:r>
-        <w:rPr>
-          <w:rFonts w:ascii="Times New Roman" w:hAnsi="Times New Roman" w:cs="Times New Roman"/>
-          <w:b/>
-          <w:bCs/>
-        </w:rPr>
-        <w:t xml:space="preserve"> </w:t>
-      </w:r>
-      <w:r>
-        <w:rPr>
-          <w:rFonts w:ascii="Times New Roman" w:hAnsi="Times New Roman" w:cs="Times New Roman"/>
-        </w:rPr>
-        <w:t>A message will be displayed saying the request has been sent for review by an administrator of the group</w:t>
-      </w:r>
-    </w:p>
-    <w:p>
-      <w:pPr>
-        <w:spacing w:line="480" w:lineRule="auto"/>
-        <w:ind w:left="720"/>
-        <w:rPr>
-          <w:rFonts w:ascii="Times New Roman" w:hAnsi="Times New Roman" w:cs="Times New Roman"/>
-        </w:rPr>
-      </w:pPr>
-      <w:r>
-        <w:rPr>
-          <w:rFonts w:ascii="Times New Roman" w:hAnsi="Times New Roman" w:cs="Times New Roman"/>
-          <w:b/>
-          <w:bCs/>
-        </w:rPr>
-        <w:t>Return Parameters:</w:t>
-      </w:r>
-      <w:r>
-        <w:rPr>
-          <w:rFonts w:ascii="Times New Roman" w:hAnsi="Times New Roman" w:cs="Times New Roman"/>
-          <w:b/>
-          <w:bCs/>
-        </w:rPr>
-        <w:t xml:space="preserve"> </w:t>
-      </w:r>
-      <w:r>
-        <w:rPr>
-          <w:rFonts w:ascii="Times New Roman" w:hAnsi="Times New Roman" w:cs="Times New Roman"/>
-        </w:rPr>
-        <w:t xml:space="preserve">The only values that will be returned </w:t>
-      </w:r>
-      <w:r>
-        <w:rPr>
-          <w:rFonts w:ascii="Times New Roman" w:hAnsi="Times New Roman" w:cs="Times New Roman"/>
-        </w:rPr>
-        <w:t>will be exceptions thrown during sending of the request, which in this case could be a database error</w:t>
-      </w:r>
-      <w:r>
-        <w:rPr>
-          <w:rFonts w:ascii="Times New Roman" w:hAnsi="Times New Roman" w:cs="Times New Roman"/>
-        </w:rPr>
-        <w:t xml:space="preserve"> or an error checking exception of the user not entering their username.</w:t>
-      </w:r>
-    </w:p>
-    <w:p>
-      <w:pPr>
-        <w:spacing w:line="480" w:lineRule="auto"/>
-        <w:ind w:left="360"/>
-        <w:rPr>
-          <w:rFonts w:ascii="Times New Roman" w:hAnsi="Times New Roman" w:cs="Times New Roman"/>
-        </w:rPr>
-      </w:pPr>
-      <w:r>
-        <w:rPr>
-          <w:rFonts w:ascii="Times New Roman" w:hAnsi="Times New Roman" w:cs="Times New Roman"/>
-          <w:b/>
-          <w:bCs/>
-        </w:rPr>
-        <w:tab/>
-        <w:t>Type:</w:t>
-      </w:r>
-      <w:r>
-        <w:rPr>
-          <w:rFonts w:ascii="Times New Roman" w:hAnsi="Times New Roman" w:cs="Times New Roman"/>
-          <w:b/>
-          <w:bCs/>
-        </w:rPr>
-        <w:t xml:space="preserve"> </w:t>
-      </w:r>
-      <w:r>
-        <w:rPr>
-          <w:rFonts w:ascii="Times New Roman" w:hAnsi="Times New Roman" w:cs="Times New Roman"/>
-        </w:rPr>
-        <w:t>Optional input will be a string</w:t>
-      </w:r>
-      <w:r>
-        <w:rPr>
-          <w:rFonts w:ascii="Times New Roman" w:hAnsi="Times New Roman" w:cs="Times New Roman"/>
-        </w:rPr>
-        <w:t>, user’s username will be extracted as a string</w:t>
-      </w:r>
-    </w:p>
-    <w:p>
-      <w:pPr>
-        <w:spacing w:line="480" w:lineRule="auto"/>
-        <w:rPr>
-          <w:rFonts w:ascii="Times New Roman" w:hAnsi="Times New Roman" w:cs="Times New Roman"/>
-        </w:rPr>
-      </w:pPr>
-      <w:proofErr w:type="gramStart"/>
-      <w:r>
-        <w:rPr>
-          <w:rFonts w:ascii="Times New Roman" w:hAnsi="Times New Roman" w:cs="Times New Roman"/>
-          <w:b/>
-          <w:bCs/>
-          <w:i/>
-          <w:iCs/>
-        </w:rPr>
-        <w:t>ApproveMember(</w:t>
-      </w:r>
-      <w:proofErr w:type="gramEnd"/>
-      <w:r>
-        <w:rPr>
-          <w:rFonts w:ascii="Times New Roman" w:hAnsi="Times New Roman" w:cs="Times New Roman"/>
-          <w:b/>
-          <w:bCs/>
-          <w:i/>
-          <w:iCs/>
-        </w:rPr>
-        <w:t>)</w:t>
-      </w:r>
-      <w:r>
-        <w:rPr>
-          <w:rFonts w:ascii="Times New Roman" w:hAnsi="Times New Roman" w:cs="Times New Roman"/>
-        </w:rPr>
-        <w:t xml:space="preserve"> – Admin approved member request</w:t>
-      </w:r>
-    </w:p>
-    <w:p>
-      <w:pPr>
-        <w:spacing w:line="480" w:lineRule="auto"/>
-        <w:ind w:left="720"/>
-        <w:rPr>
-          <w:rFonts w:ascii="Times New Roman" w:hAnsi="Times New Roman" w:cs="Times New Roman"/>
-        </w:rPr>
-      </w:pPr>
-      <w:r>
-        <w:rPr>
-          <w:rFonts w:ascii="Times New Roman" w:hAnsi="Times New Roman" w:cs="Times New Roman"/>
-          <w:b/>
-          <w:bCs/>
-        </w:rPr>
-        <w:t>Input:</w:t>
-      </w:r>
-      <w:r>
-        <w:rPr>
-          <w:rFonts w:ascii="Times New Roman" w:hAnsi="Times New Roman" w:cs="Times New Roman"/>
-          <w:b/>
-          <w:bCs/>
-        </w:rPr>
-        <w:t xml:space="preserve"> </w:t>
-      </w:r>
-      <w:r>
-        <w:rPr>
-          <w:rFonts w:ascii="Times New Roman" w:hAnsi="Times New Roman" w:cs="Times New Roman"/>
-        </w:rPr>
-        <w:t xml:space="preserve">The function will take in </w:t>
-      </w:r>
-      <w:r>
-        <w:rPr>
-          <w:rFonts w:ascii="Times New Roman" w:hAnsi="Times New Roman" w:cs="Times New Roman"/>
-        </w:rPr>
-        <w:t xml:space="preserve">the </w:t>
-      </w:r>
-      <w:r>
-        <w:rPr>
-          <w:rFonts w:ascii="Times New Roman" w:hAnsi="Times New Roman" w:cs="Times New Roman"/>
-        </w:rPr>
-        <w:t>admin’s answer to the request</w:t>
-      </w:r>
-      <w:r>
-        <w:rPr>
-          <w:rFonts w:ascii="Times New Roman" w:hAnsi="Times New Roman" w:cs="Times New Roman"/>
-        </w:rPr>
-        <w:t>, which will be to approve or to deny access</w:t>
-      </w:r>
-    </w:p>
-    <w:p>
-      <w:pPr>
-        <w:spacing w:line="480" w:lineRule="auto"/>
-        <w:ind w:left="720"/>
-        <w:rPr>
-          <w:rFonts w:ascii="Times New Roman" w:hAnsi="Times New Roman" w:cs="Times New Roman"/>
-        </w:rPr>
-      </w:pPr>
-      <w:r>
-        <w:rPr>
-          <w:rFonts w:ascii="Times New Roman" w:hAnsi="Times New Roman" w:cs="Times New Roman"/>
-          <w:b/>
-          <w:bCs/>
-        </w:rPr>
-        <w:t>Output:</w:t>
-      </w:r>
-      <w:r>
-        <w:rPr>
-          <w:rFonts w:ascii="Times New Roman" w:hAnsi="Times New Roman" w:cs="Times New Roman"/>
-          <w:b/>
-          <w:bCs/>
-        </w:rPr>
-        <w:t xml:space="preserve"> </w:t>
-      </w:r>
-      <w:r>
-        <w:rPr>
-          <w:rFonts w:ascii="Times New Roman" w:hAnsi="Times New Roman" w:cs="Times New Roman"/>
-        </w:rPr>
-        <w:t>The function will output a message depending on admin’s answer to the request</w:t>
-      </w:r>
-      <w:r>
-        <w:rPr>
-          <w:rFonts w:ascii="Times New Roman" w:hAnsi="Times New Roman" w:cs="Times New Roman"/>
-        </w:rPr>
-        <w:t>, if the admin approves the request, the user will be added to the group. If the admin denies the request, a message will be sent to the user denied.</w:t>
-      </w:r>
-    </w:p>
-    <w:p>
-      <w:pPr>
-        <w:spacing w:line="480" w:lineRule="auto"/>
-        <w:ind w:left="720"/>
-        <w:rPr>
-          <w:rFonts w:ascii="Times New Roman" w:hAnsi="Times New Roman" w:cs="Times New Roman"/>
-        </w:rPr>
-      </w:pPr>
-      <w:r>
-        <w:rPr>
-          <w:rFonts w:ascii="Times New Roman" w:hAnsi="Times New Roman" w:cs="Times New Roman"/>
-          <w:b/>
-          <w:bCs/>
-        </w:rPr>
-        <w:t xml:space="preserve"> </w:t>
-      </w:r>
-      <w:r>
-        <w:rPr>
-          <w:rFonts w:ascii="Times New Roman" w:hAnsi="Times New Roman" w:cs="Times New Roman"/>
-          <w:b/>
-          <w:bCs/>
-        </w:rPr>
-        <w:t>Return Parameters:</w:t>
-      </w:r>
-      <w:r>
-        <w:rPr>
-          <w:rFonts w:ascii="Times New Roman" w:hAnsi="Times New Roman" w:cs="Times New Roman"/>
-          <w:b/>
-          <w:bCs/>
-        </w:rPr>
-        <w:t xml:space="preserve"> </w:t>
-      </w:r>
-      <w:r>
-        <w:rPr>
-          <w:rFonts w:ascii="Times New Roman" w:hAnsi="Times New Roman" w:cs="Times New Roman"/>
-        </w:rPr>
-        <w:t xml:space="preserve">The values returned will be </w:t>
-      </w:r>
-      <w:r>
-        <w:rPr>
-          <w:rFonts w:ascii="Times New Roman" w:hAnsi="Times New Roman" w:cs="Times New Roman"/>
-        </w:rPr>
-        <w:t xml:space="preserve">the </w:t>
-      </w:r>
-      <w:r>
-        <w:rPr>
-          <w:rFonts w:ascii="Times New Roman" w:hAnsi="Times New Roman" w:cs="Times New Roman"/>
-        </w:rPr>
-        <w:t xml:space="preserve">messages returned during error </w:t>
-      </w:r>
-      <w:r>
-        <w:rPr>
-          <w:rFonts w:ascii="Times New Roman" w:hAnsi="Times New Roman" w:cs="Times New Roman"/>
-        </w:rPr>
-        <w:t xml:space="preserve">   </w:t>
-      </w:r>
-      <w:r>
-        <w:rPr>
-          <w:rFonts w:ascii="Times New Roman" w:hAnsi="Times New Roman" w:cs="Times New Roman"/>
-        </w:rPr>
-        <w:t xml:space="preserve">exceptions, </w:t>
-      </w:r>
-      <w:r>
-        <w:rPr>
-          <w:rFonts w:ascii="Times New Roman" w:hAnsi="Times New Roman" w:cs="Times New Roman"/>
-        </w:rPr>
-        <w:t>which could be an error in adding the user to the</w:t>
-      </w:r>
-      <w:r>
-        <w:rPr>
-          <w:rFonts w:ascii="Times New Roman" w:hAnsi="Times New Roman" w:cs="Times New Roman"/>
-        </w:rPr>
-        <w:t xml:space="preserve"> group</w:t>
-      </w:r>
-    </w:p>
-    <w:p>
-      <w:pPr>
-        <w:spacing w:line="480" w:lineRule="auto"/>
-        <w:ind w:left="720"/>
-        <w:rPr>
-          <w:rFonts w:ascii="Times New Roman" w:hAnsi="Times New Roman" w:cs="Times New Roman"/>
-        </w:rPr>
-      </w:pPr>
-      <w:r>
-        <w:rPr>
-          <w:rFonts w:ascii="Times New Roman" w:hAnsi="Times New Roman" w:cs="Times New Roman"/>
-          <w:b/>
-          <w:bCs/>
-        </w:rPr>
-        <w:lastRenderedPageBreak/>
-        <w:t>Type:</w:t>
-      </w:r>
-      <w:r>
-        <w:rPr>
-          <w:rFonts w:ascii="Times New Roman" w:hAnsi="Times New Roman" w:cs="Times New Roman"/>
-          <w:b/>
-          <w:bCs/>
-        </w:rPr>
-        <w:t xml:space="preserve"> </w:t>
-      </w:r>
-      <w:r>
-        <w:rPr>
-          <w:rFonts w:ascii="Times New Roman" w:hAnsi="Times New Roman" w:cs="Times New Roman"/>
-        </w:rPr>
-        <w:t>The input will be a flag sent to the program based on the admin’s response to the request</w:t>
-      </w:r>
-    </w:p>
-    <w:p>
-      <w:pPr>
-        <w:spacing w:line="480" w:lineRule="auto"/>
-        <w:rPr>
-          <w:rFonts w:ascii="Times New Roman" w:hAnsi="Times New Roman" w:cs="Times New Roman"/>
-        </w:rPr>
-      </w:pPr>
-      <w:proofErr w:type="gramStart"/>
-      <w:r>
-        <w:rPr>
-          <w:rFonts w:ascii="Times New Roman" w:hAnsi="Times New Roman" w:cs="Times New Roman"/>
-          <w:b/>
-          <w:bCs/>
-          <w:i/>
-          <w:iCs/>
-        </w:rPr>
-        <w:t>RemoveMember(</w:t>
-      </w:r>
-      <w:proofErr w:type="gramEnd"/>
-      <w:r>
-        <w:rPr>
-          <w:rFonts w:ascii="Times New Roman" w:hAnsi="Times New Roman" w:cs="Times New Roman"/>
-          <w:b/>
-          <w:bCs/>
-          <w:i/>
-          <w:iCs/>
-        </w:rPr>
-        <w:t>)</w:t>
-      </w:r>
-      <w:r>
-        <w:rPr>
-          <w:rFonts w:ascii="Times New Roman" w:hAnsi="Times New Roman" w:cs="Times New Roman"/>
-        </w:rPr>
-        <w:t xml:space="preserve"> – Admin removes user from group</w:t>
-      </w:r>
-    </w:p>
-    <w:p>
-      <w:pPr>
-        <w:spacing w:line="480" w:lineRule="auto"/>
-        <w:ind w:left="720"/>
-        <w:rPr>
-          <w:rFonts w:ascii="Times New Roman" w:hAnsi="Times New Roman" w:cs="Times New Roman"/>
-        </w:rPr>
-      </w:pPr>
-      <w:r>
-        <w:rPr>
-          <w:rFonts w:ascii="Times New Roman" w:hAnsi="Times New Roman" w:cs="Times New Roman"/>
-          <w:b/>
-          <w:bCs/>
-        </w:rPr>
-        <w:t>Input:</w:t>
-      </w:r>
-      <w:r>
-        <w:rPr>
-          <w:rFonts w:ascii="Times New Roman" w:hAnsi="Times New Roman" w:cs="Times New Roman"/>
-          <w:b/>
-          <w:bCs/>
-        </w:rPr>
-        <w:t xml:space="preserve"> </w:t>
-      </w:r>
-      <w:r>
-        <w:rPr>
-          <w:rFonts w:ascii="Times New Roman" w:hAnsi="Times New Roman" w:cs="Times New Roman"/>
-        </w:rPr>
-        <w:t>Function will receive the username or name of the member to be removed from the group</w:t>
-      </w:r>
-    </w:p>
-    <w:p>
-      <w:pPr>
-        <w:spacing w:line="480" w:lineRule="auto"/>
-        <w:ind w:left="720"/>
-        <w:rPr>
-          <w:rFonts w:ascii="Times New Roman" w:hAnsi="Times New Roman" w:cs="Times New Roman"/>
-        </w:rPr>
-      </w:pPr>
-      <w:r>
-        <w:rPr>
-          <w:rFonts w:ascii="Times New Roman" w:hAnsi="Times New Roman" w:cs="Times New Roman"/>
-          <w:b/>
-          <w:bCs/>
-        </w:rPr>
-        <w:t>Output:</w:t>
-      </w:r>
-      <w:r>
-        <w:rPr>
-          <w:rFonts w:ascii="Times New Roman" w:hAnsi="Times New Roman" w:cs="Times New Roman"/>
-          <w:b/>
-          <w:bCs/>
-        </w:rPr>
-        <w:t xml:space="preserve"> </w:t>
-      </w:r>
-      <w:r>
-        <w:rPr>
-          <w:rFonts w:ascii="Times New Roman" w:hAnsi="Times New Roman" w:cs="Times New Roman"/>
-        </w:rPr>
-        <w:t>Message of success will be displayed when the desired member is successfully removed from the group</w:t>
-      </w:r>
-    </w:p>
-    <w:p>
-      <w:pPr>
-        <w:spacing w:line="480" w:lineRule="auto"/>
-        <w:ind w:left="720"/>
-        <w:rPr>
-          <w:rFonts w:ascii="Times New Roman" w:hAnsi="Times New Roman" w:cs="Times New Roman"/>
-        </w:rPr>
-      </w:pPr>
-      <w:r>
-        <w:rPr>
-          <w:rFonts w:ascii="Times New Roman" w:hAnsi="Times New Roman" w:cs="Times New Roman"/>
-          <w:b/>
-          <w:bCs/>
-        </w:rPr>
-        <w:t>Return Parameters:</w:t>
-      </w:r>
-      <w:r>
-        <w:rPr>
-          <w:rFonts w:ascii="Times New Roman" w:hAnsi="Times New Roman" w:cs="Times New Roman"/>
-          <w:b/>
-          <w:bCs/>
-        </w:rPr>
-        <w:t xml:space="preserve"> </w:t>
-      </w:r>
-      <w:r>
-        <w:rPr>
-          <w:rFonts w:ascii="Times New Roman" w:hAnsi="Times New Roman" w:cs="Times New Roman"/>
-        </w:rPr>
-        <w:t>Values returned will be messages during error checking, which in this case could be an error in finding the member or removing the member</w:t>
-      </w:r>
-    </w:p>
-    <w:p>
-      <w:pPr>
-        <w:spacing w:line="480" w:lineRule="auto"/>
-        <w:ind w:left="360"/>
-        <w:rPr>
-          <w:rFonts w:ascii="Times New Roman" w:hAnsi="Times New Roman" w:cs="Times New Roman"/>
-        </w:rPr>
-      </w:pPr>
-      <w:r>
-        <w:rPr>
-          <w:rFonts w:ascii="Times New Roman" w:hAnsi="Times New Roman" w:cs="Times New Roman"/>
-          <w:b/>
-          <w:bCs/>
-        </w:rPr>
-        <w:tab/>
-        <w:t>Type:</w:t>
-      </w:r>
-      <w:r>
-        <w:rPr>
-          <w:rFonts w:ascii="Times New Roman" w:hAnsi="Times New Roman" w:cs="Times New Roman"/>
-          <w:b/>
-          <w:bCs/>
-        </w:rPr>
-        <w:t xml:space="preserve"> </w:t>
-      </w:r>
-      <w:r>
-        <w:rPr>
-          <w:rFonts w:ascii="Times New Roman" w:hAnsi="Times New Roman" w:cs="Times New Roman"/>
-        </w:rPr>
-        <w:t>Desired member’s username will be passed in as a string</w:t>
-      </w:r>
-    </w:p>
-    <w:p>
-      <w:pPr>
-        <w:spacing w:line="480" w:lineRule="auto"/>
-        <w:rPr>
-          <w:rFonts w:ascii="Times New Roman" w:hAnsi="Times New Roman" w:cs="Times New Roman"/>
-        </w:rPr>
-      </w:pPr>
-      <w:proofErr w:type="gramStart"/>
-      <w:r>
-        <w:rPr>
-          <w:rFonts w:ascii="Times New Roman" w:hAnsi="Times New Roman" w:cs="Times New Roman"/>
-          <w:b/>
-          <w:bCs/>
-          <w:i/>
-          <w:iCs/>
-        </w:rPr>
-        <w:t>ViewLeaderboard(</w:t>
-      </w:r>
-      <w:proofErr w:type="gramEnd"/>
-      <w:r>
-        <w:rPr>
-          <w:rFonts w:ascii="Times New Roman" w:hAnsi="Times New Roman" w:cs="Times New Roman"/>
-          <w:b/>
-          <w:bCs/>
-          <w:i/>
-          <w:iCs/>
-        </w:rPr>
-        <w:t>)</w:t>
+        <w:t>ViewLeaderboard()</w:t>
       </w:r>
       <w:r>
         <w:rPr>
@@ -10447,7 +10005,6 @@
           <w:rFonts w:ascii="Times New Roman" w:hAnsi="Times New Roman" w:cs="Times New Roman"/>
         </w:rPr>
       </w:pPr>
-      <w:proofErr w:type="gramStart"/>
       <w:r>
         <w:rPr>
           <w:rFonts w:ascii="Times New Roman" w:hAnsi="Times New Roman" w:cs="Times New Roman"/>
@@ -10458,7 +10015,6 @@
         </w:rPr>
         <w:t>ValidateLogin(</w:t>
       </w:r>
-      <w:proofErr w:type="gramEnd"/>
       <w:r>
         <w:rPr>
           <w:rFonts w:ascii="Times New Roman" w:hAnsi="Times New Roman" w:cs="Times New Roman"/>
@@ -10517,14 +10073,7 @@
         <w:rPr>
           <w:rFonts w:ascii="Times New Roman" w:hAnsi="Times New Roman" w:cs="Times New Roman"/>
         </w:rPr>
-        <w:t xml:space="preserve">password. This email will be checked to see if </w:t>
-      </w:r>
-      <w:proofErr w:type="gramStart"/>
-      <w:r>
-        <w:rPr>
-          <w:rFonts w:ascii="Times New Roman" w:hAnsi="Times New Roman" w:cs="Times New Roman"/>
-        </w:rPr>
-        <w:t xml:space="preserve">it </w:t>
+        <w:t xml:space="preserve">password. This email will be checked to see if it </w:t>
       </w:r>
       <w:r>
         <w:rPr>
@@ -10536,14 +10085,7 @@
         <w:rPr>
           <w:rFonts w:ascii="Times New Roman" w:hAnsi="Times New Roman" w:cs="Times New Roman"/>
         </w:rPr>
-        <w:t>contains</w:t>
-      </w:r>
-      <w:proofErr w:type="gramEnd"/>
-      <w:r>
-        <w:rPr>
-          <w:rFonts w:ascii="Times New Roman" w:hAnsi="Times New Roman" w:cs="Times New Roman"/>
-        </w:rPr>
-        <w:t xml:space="preserve"> @pennwest.edu at the end. </w:t>
+        <w:t xml:space="preserve">contains @pennwest.edu at the end. </w:t>
       </w:r>
       <w:r>
         <w:rPr>
@@ -10689,7 +10231,6 @@
           <w:rFonts w:ascii="Times New Roman" w:hAnsi="Times New Roman" w:cs="Times New Roman"/>
         </w:rPr>
       </w:pPr>
-      <w:proofErr w:type="gramStart"/>
       <w:r>
         <w:rPr>
           <w:rFonts w:ascii="Times New Roman" w:hAnsi="Times New Roman" w:cs="Times New Roman"/>
@@ -10698,9 +10239,194 @@
           <w:i/>
           <w:iCs/>
         </w:rPr>
-        <w:t>UpdateProfile(</w:t>
-      </w:r>
-      <w:proofErr w:type="gramEnd"/>
+        <w:t>UpdateProfile()</w:t>
+      </w:r>
+      <w:r>
+        <w:rPr>
+          <w:rFonts w:ascii="Times New Roman" w:hAnsi="Times New Roman" w:cs="Times New Roman"/>
+        </w:rPr>
+        <w:t xml:space="preserve"> – Lets users modify their profile fields</w:t>
+      </w:r>
+    </w:p>
+    <w:p>
+      <w:pPr>
+        <w:spacing w:line="480" w:lineRule="auto"/>
+        <w:ind w:firstLine="720"/>
+        <w:rPr>
+          <w:rFonts w:ascii="Times New Roman" w:hAnsi="Times New Roman" w:cs="Times New Roman"/>
+        </w:rPr>
+      </w:pPr>
+      <w:r>
+        <w:rPr>
+          <w:rFonts w:ascii="Times New Roman" w:hAnsi="Times New Roman" w:cs="Times New Roman"/>
+          <w:b/>
+          <w:bCs/>
+        </w:rPr>
+        <w:t xml:space="preserve"> </w:t>
+      </w:r>
+      <w:r>
+        <w:rPr>
+          <w:rFonts w:ascii="Times New Roman" w:hAnsi="Times New Roman" w:cs="Times New Roman"/>
+          <w:b/>
+          <w:bCs/>
+        </w:rPr>
+        <w:t>Input:</w:t>
+      </w:r>
+      <w:r>
+        <w:rPr>
+          <w:rFonts w:ascii="Times New Roman" w:hAnsi="Times New Roman" w:cs="Times New Roman"/>
+          <w:b/>
+          <w:bCs/>
+        </w:rPr>
+        <w:t xml:space="preserve"> </w:t>
+      </w:r>
+      <w:r>
+        <w:rPr>
+          <w:rFonts w:ascii="Times New Roman" w:hAnsi="Times New Roman" w:cs="Times New Roman"/>
+        </w:rPr>
+        <w:t xml:space="preserve">User will go </w:t>
+      </w:r>
+      <w:r>
+        <w:rPr>
+          <w:rFonts w:ascii="Times New Roman" w:hAnsi="Times New Roman" w:cs="Times New Roman"/>
+        </w:rPr>
+        <w:t>into</w:t>
+      </w:r>
+      <w:r>
+        <w:rPr>
+          <w:rFonts w:ascii="Times New Roman" w:hAnsi="Times New Roman" w:cs="Times New Roman"/>
+        </w:rPr>
+        <w:t xml:space="preserve"> their profile section and make their changes that they desire</w:t>
+      </w:r>
+    </w:p>
+    <w:p>
+      <w:pPr>
+        <w:spacing w:line="480" w:lineRule="auto"/>
+        <w:ind w:left="720"/>
+        <w:rPr>
+          <w:rFonts w:ascii="Times New Roman" w:hAnsi="Times New Roman" w:cs="Times New Roman"/>
+        </w:rPr>
+      </w:pPr>
+      <w:r>
+        <w:rPr>
+          <w:rFonts w:ascii="Times New Roman" w:hAnsi="Times New Roman" w:cs="Times New Roman"/>
+          <w:b/>
+          <w:bCs/>
+        </w:rPr>
+        <w:t xml:space="preserve"> </w:t>
+      </w:r>
+      <w:r>
+        <w:rPr>
+          <w:rFonts w:ascii="Times New Roman" w:hAnsi="Times New Roman" w:cs="Times New Roman"/>
+          <w:b/>
+          <w:bCs/>
+        </w:rPr>
+        <w:t>Output:</w:t>
+      </w:r>
+      <w:r>
+        <w:rPr>
+          <w:rFonts w:ascii="Times New Roman" w:hAnsi="Times New Roman" w:cs="Times New Roman"/>
+          <w:b/>
+          <w:bCs/>
+        </w:rPr>
+        <w:t xml:space="preserve"> </w:t>
+      </w:r>
+      <w:r>
+        <w:rPr>
+          <w:rFonts w:ascii="Times New Roman" w:hAnsi="Times New Roman" w:cs="Times New Roman"/>
+        </w:rPr>
+        <w:t>Message will be displayed that the changes were successful</w:t>
+      </w:r>
+    </w:p>
+    <w:p>
+      <w:pPr>
+        <w:spacing w:line="480" w:lineRule="auto"/>
+        <w:ind w:left="720" w:firstLine="60"/>
+        <w:rPr>
+          <w:rFonts w:ascii="Times New Roman" w:hAnsi="Times New Roman" w:cs="Times New Roman"/>
+        </w:rPr>
+      </w:pPr>
+      <w:r>
+        <w:rPr>
+          <w:rFonts w:ascii="Times New Roman" w:hAnsi="Times New Roman" w:cs="Times New Roman"/>
+          <w:b/>
+          <w:bCs/>
+        </w:rPr>
+        <w:t>Return Parameters:</w:t>
+      </w:r>
+      <w:r>
+        <w:rPr>
+          <w:rFonts w:ascii="Times New Roman" w:hAnsi="Times New Roman" w:cs="Times New Roman"/>
+          <w:b/>
+          <w:bCs/>
+        </w:rPr>
+        <w:t xml:space="preserve"> </w:t>
+      </w:r>
+      <w:r>
+        <w:rPr>
+          <w:rFonts w:ascii="Times New Roman" w:hAnsi="Times New Roman" w:cs="Times New Roman"/>
+        </w:rPr>
+        <w:t xml:space="preserve">Values returned by this function include a success message or a message dealing with </w:t>
+      </w:r>
+      <w:r>
+        <w:rPr>
+          <w:rFonts w:ascii="Times New Roman" w:hAnsi="Times New Roman" w:cs="Times New Roman"/>
+        </w:rPr>
+        <w:t>error</w:t>
+      </w:r>
+      <w:r>
+        <w:rPr>
+          <w:rFonts w:ascii="Times New Roman" w:hAnsi="Times New Roman" w:cs="Times New Roman"/>
+        </w:rPr>
+        <w:t xml:space="preserve"> checking, which could include missing information in a field</w:t>
+      </w:r>
+    </w:p>
+    <w:p>
+      <w:pPr>
+        <w:spacing w:line="480" w:lineRule="auto"/>
+        <w:ind w:left="720"/>
+        <w:rPr>
+          <w:rFonts w:ascii="Times New Roman" w:hAnsi="Times New Roman" w:cs="Times New Roman"/>
+        </w:rPr>
+      </w:pPr>
+      <w:r>
+        <w:rPr>
+          <w:rFonts w:ascii="Times New Roman" w:hAnsi="Times New Roman" w:cs="Times New Roman"/>
+          <w:b/>
+          <w:bCs/>
+        </w:rPr>
+        <w:t xml:space="preserve"> </w:t>
+      </w:r>
+      <w:r>
+        <w:rPr>
+          <w:rFonts w:ascii="Times New Roman" w:hAnsi="Times New Roman" w:cs="Times New Roman"/>
+          <w:b/>
+          <w:bCs/>
+        </w:rPr>
+        <w:t>Type:</w:t>
+      </w:r>
+      <w:r>
+        <w:rPr>
+          <w:rFonts w:ascii="Times New Roman" w:hAnsi="Times New Roman" w:cs="Times New Roman"/>
+          <w:b/>
+          <w:bCs/>
+        </w:rPr>
+        <w:t xml:space="preserve"> </w:t>
+      </w:r>
+      <w:r>
+        <w:rPr>
+          <w:rFonts w:ascii="Times New Roman" w:hAnsi="Times New Roman" w:cs="Times New Roman"/>
+        </w:rPr>
+        <w:t>User will be modifying strings in their profile</w:t>
+      </w:r>
+    </w:p>
+    <w:p>
+      <w:pPr>
+        <w:spacing w:line="480" w:lineRule="auto"/>
+        <w:rPr>
+          <w:rFonts w:ascii="Times New Roman" w:hAnsi="Times New Roman" w:cs="Times New Roman"/>
+        </w:rPr>
+      </w:pPr>
       <w:r>
         <w:rPr>
           <w:rFonts w:ascii="Times New Roman" w:hAnsi="Times New Roman" w:cs="Times New Roman"/>
@@ -10709,13 +10435,131 @@
           <w:i/>
           <w:iCs/>
         </w:rPr>
-        <w:t>)</w:t>
-      </w:r>
-      <w:r>
-        <w:rPr>
-          <w:rFonts w:ascii="Times New Roman" w:hAnsi="Times New Roman" w:cs="Times New Roman"/>
-        </w:rPr>
-        <w:t xml:space="preserve"> – Lets users modify their profile fields</w:t>
+        <w:t>JoinGroup()</w:t>
+      </w:r>
+      <w:r>
+        <w:rPr>
+          <w:rFonts w:ascii="Times New Roman" w:hAnsi="Times New Roman" w:cs="Times New Roman"/>
+        </w:rPr>
+        <w:t xml:space="preserve"> – Sends request to join a certain group</w:t>
+      </w:r>
+    </w:p>
+    <w:p>
+      <w:pPr>
+        <w:spacing w:line="480" w:lineRule="auto"/>
+        <w:ind w:left="720"/>
+        <w:rPr>
+          <w:rFonts w:ascii="Times New Roman" w:hAnsi="Times New Roman" w:cs="Times New Roman"/>
+        </w:rPr>
+      </w:pPr>
+      <w:r>
+        <w:rPr>
+          <w:rFonts w:ascii="Times New Roman" w:hAnsi="Times New Roman" w:cs="Times New Roman"/>
+          <w:b/>
+          <w:bCs/>
+        </w:rPr>
+        <w:t xml:space="preserve"> </w:t>
+      </w:r>
+      <w:r>
+        <w:rPr>
+          <w:rFonts w:ascii="Times New Roman" w:hAnsi="Times New Roman" w:cs="Times New Roman"/>
+          <w:b/>
+          <w:bCs/>
+        </w:rPr>
+        <w:t>Input:</w:t>
+      </w:r>
+      <w:r>
+        <w:rPr>
+          <w:rFonts w:ascii="Times New Roman" w:hAnsi="Times New Roman" w:cs="Times New Roman"/>
+          <w:b/>
+          <w:bCs/>
+        </w:rPr>
+        <w:t xml:space="preserve"> </w:t>
+      </w:r>
+      <w:r>
+        <w:rPr>
+          <w:rFonts w:ascii="Times New Roman" w:hAnsi="Times New Roman" w:cs="Times New Roman"/>
+        </w:rPr>
+        <w:t>User presses button to request to join a group, along with optional reason why they would like to join</w:t>
+      </w:r>
+    </w:p>
+    <w:p>
+      <w:pPr>
+        <w:spacing w:line="480" w:lineRule="auto"/>
+        <w:ind w:left="720"/>
+        <w:rPr>
+          <w:rFonts w:ascii="Times New Roman" w:hAnsi="Times New Roman" w:cs="Times New Roman"/>
+        </w:rPr>
+      </w:pPr>
+      <w:r>
+        <w:rPr>
+          <w:rFonts w:ascii="Times New Roman" w:hAnsi="Times New Roman" w:cs="Times New Roman"/>
+          <w:b/>
+          <w:bCs/>
+        </w:rPr>
+        <w:t xml:space="preserve"> </w:t>
+      </w:r>
+      <w:r>
+        <w:rPr>
+          <w:rFonts w:ascii="Times New Roman" w:hAnsi="Times New Roman" w:cs="Times New Roman"/>
+          <w:b/>
+          <w:bCs/>
+        </w:rPr>
+        <w:t>Output:</w:t>
+      </w:r>
+      <w:r>
+        <w:rPr>
+          <w:rFonts w:ascii="Times New Roman" w:hAnsi="Times New Roman" w:cs="Times New Roman"/>
+          <w:b/>
+          <w:bCs/>
+        </w:rPr>
+        <w:t xml:space="preserve"> </w:t>
+      </w:r>
+      <w:r>
+        <w:rPr>
+          <w:rFonts w:ascii="Times New Roman" w:hAnsi="Times New Roman" w:cs="Times New Roman"/>
+        </w:rPr>
+        <w:t>A message saying the request was successfully sent will be displayed to the user</w:t>
+      </w:r>
+    </w:p>
+    <w:p>
+      <w:pPr>
+        <w:spacing w:line="480" w:lineRule="auto"/>
+        <w:ind w:left="720"/>
+        <w:rPr>
+          <w:rFonts w:ascii="Times New Roman" w:hAnsi="Times New Roman" w:cs="Times New Roman"/>
+        </w:rPr>
+      </w:pPr>
+      <w:r>
+        <w:rPr>
+          <w:rFonts w:ascii="Times New Roman" w:hAnsi="Times New Roman" w:cs="Times New Roman"/>
+          <w:b/>
+          <w:bCs/>
+        </w:rPr>
+        <w:lastRenderedPageBreak/>
+        <w:t xml:space="preserve"> </w:t>
+      </w:r>
+      <w:r>
+        <w:rPr>
+          <w:rFonts w:ascii="Times New Roman" w:hAnsi="Times New Roman" w:cs="Times New Roman"/>
+          <w:b/>
+          <w:bCs/>
+        </w:rPr>
+        <w:t>Return Parameters:</w:t>
+      </w:r>
+      <w:r>
+        <w:rPr>
+          <w:rFonts w:ascii="Times New Roman" w:hAnsi="Times New Roman" w:cs="Times New Roman"/>
+          <w:b/>
+          <w:bCs/>
+        </w:rPr>
+        <w:t xml:space="preserve"> </w:t>
+      </w:r>
+      <w:r>
+        <w:rPr>
+          <w:rFonts w:ascii="Times New Roman" w:hAnsi="Times New Roman" w:cs="Times New Roman"/>
+        </w:rPr>
+        <w:t>Values returned by this function will be messages due to error checking, which in this case could be an error in sending the request to the proper administrator of the group</w:t>
       </w:r>
     </w:p>
     <w:p>
@@ -10740,7 +10584,7 @@
           <w:b/>
           <w:bCs/>
         </w:rPr>
-        <w:t>Input:</w:t>
+        <w:t>Type:</w:t>
       </w:r>
       <w:r>
         <w:rPr>
@@ -10754,150 +10598,16 @@
         <w:rPr>
           <w:rFonts w:ascii="Times New Roman" w:hAnsi="Times New Roman" w:cs="Times New Roman"/>
         </w:rPr>
-        <w:t xml:space="preserve">User will go </w:t>
-      </w:r>
-      <w:r>
-        <w:rPr>
-          <w:rFonts w:ascii="Times New Roman" w:hAnsi="Times New Roman" w:cs="Times New Roman"/>
-        </w:rPr>
-        <w:t>into</w:t>
-      </w:r>
-      <w:r>
-        <w:rPr>
-          <w:rFonts w:ascii="Times New Roman" w:hAnsi="Times New Roman" w:cs="Times New Roman"/>
-        </w:rPr>
-        <w:t xml:space="preserve"> their profile section and make their changes that they desire</w:t>
-      </w:r>
-    </w:p>
-    <w:p>
-      <w:pPr>
-        <w:spacing w:line="480" w:lineRule="auto"/>
-        <w:ind w:left="720"/>
-        <w:rPr>
-          <w:rFonts w:ascii="Times New Roman" w:hAnsi="Times New Roman" w:cs="Times New Roman"/>
-        </w:rPr>
-      </w:pPr>
-      <w:r>
-        <w:rPr>
-          <w:rFonts w:ascii="Times New Roman" w:hAnsi="Times New Roman" w:cs="Times New Roman"/>
-          <w:b/>
-          <w:bCs/>
-        </w:rPr>
-        <w:t xml:space="preserve"> </w:t>
-      </w:r>
-      <w:r>
-        <w:rPr>
-          <w:rFonts w:ascii="Times New Roman" w:hAnsi="Times New Roman" w:cs="Times New Roman"/>
-          <w:b/>
-          <w:bCs/>
-        </w:rPr>
-        <w:t>Output:</w:t>
-      </w:r>
-      <w:r>
-        <w:rPr>
-          <w:rFonts w:ascii="Times New Roman" w:hAnsi="Times New Roman" w:cs="Times New Roman"/>
-          <w:b/>
-          <w:bCs/>
-        </w:rPr>
-        <w:t xml:space="preserve"> </w:t>
-      </w:r>
-      <w:r>
-        <w:rPr>
-          <w:rFonts w:ascii="Times New Roman" w:hAnsi="Times New Roman" w:cs="Times New Roman"/>
-        </w:rPr>
-        <w:t>Message will be displayed that the changes were successful</w:t>
-      </w:r>
-    </w:p>
-    <w:p>
-      <w:pPr>
-        <w:spacing w:line="480" w:lineRule="auto"/>
-        <w:ind w:left="720" w:firstLine="60"/>
-        <w:rPr>
-          <w:rFonts w:ascii="Times New Roman" w:hAnsi="Times New Roman" w:cs="Times New Roman"/>
-        </w:rPr>
-      </w:pPr>
-      <w:r>
-        <w:rPr>
-          <w:rFonts w:ascii="Times New Roman" w:hAnsi="Times New Roman" w:cs="Times New Roman"/>
-          <w:b/>
-          <w:bCs/>
-        </w:rPr>
-        <w:t>Return Parameters:</w:t>
-      </w:r>
-      <w:r>
-        <w:rPr>
-          <w:rFonts w:ascii="Times New Roman" w:hAnsi="Times New Roman" w:cs="Times New Roman"/>
-          <w:b/>
-          <w:bCs/>
-        </w:rPr>
-        <w:t xml:space="preserve"> </w:t>
-      </w:r>
-      <w:r>
-        <w:rPr>
-          <w:rFonts w:ascii="Times New Roman" w:hAnsi="Times New Roman" w:cs="Times New Roman"/>
-        </w:rPr>
-        <w:t xml:space="preserve">Values returned by this function include a success message or a message dealing with </w:t>
-      </w:r>
-      <w:r>
-        <w:rPr>
-          <w:rFonts w:ascii="Times New Roman" w:hAnsi="Times New Roman" w:cs="Times New Roman"/>
-        </w:rPr>
-        <w:t>error</w:t>
-      </w:r>
-      <w:r>
-        <w:rPr>
-          <w:rFonts w:ascii="Times New Roman" w:hAnsi="Times New Roman" w:cs="Times New Roman"/>
-        </w:rPr>
-        <w:t xml:space="preserve"> checking, which could include missing information in a field</w:t>
-      </w:r>
-    </w:p>
-    <w:p>
-      <w:pPr>
-        <w:spacing w:line="480" w:lineRule="auto"/>
-        <w:ind w:left="720"/>
-        <w:rPr>
-          <w:rFonts w:ascii="Times New Roman" w:hAnsi="Times New Roman" w:cs="Times New Roman"/>
-        </w:rPr>
-      </w:pPr>
-      <w:r>
-        <w:rPr>
-          <w:rFonts w:ascii="Times New Roman" w:hAnsi="Times New Roman" w:cs="Times New Roman"/>
-          <w:b/>
-          <w:bCs/>
-        </w:rPr>
-        <w:t xml:space="preserve"> </w:t>
-      </w:r>
-      <w:r>
-        <w:rPr>
-          <w:rFonts w:ascii="Times New Roman" w:hAnsi="Times New Roman" w:cs="Times New Roman"/>
-          <w:b/>
-          <w:bCs/>
-        </w:rPr>
-        <w:t>Type:</w:t>
-      </w:r>
-      <w:r>
-        <w:rPr>
-          <w:rFonts w:ascii="Times New Roman" w:hAnsi="Times New Roman" w:cs="Times New Roman"/>
-          <w:b/>
-          <w:bCs/>
-        </w:rPr>
-        <w:t xml:space="preserve"> </w:t>
-      </w:r>
-      <w:r>
-        <w:rPr>
-          <w:rFonts w:ascii="Times New Roman" w:hAnsi="Times New Roman" w:cs="Times New Roman"/>
-        </w:rPr>
-        <w:t>User will be modifying strings in their profile</w:t>
-      </w:r>
-    </w:p>
-    <w:p>
-      <w:pPr>
-        <w:spacing w:line="480" w:lineRule="auto"/>
-        <w:rPr>
-          <w:rFonts w:ascii="Times New Roman" w:hAnsi="Times New Roman" w:cs="Times New Roman"/>
-        </w:rPr>
-      </w:pPr>
-      <w:proofErr w:type="gramStart"/>
+        <w:t>Optional reason to join the group is a string, request is a button</w:t>
+      </w:r>
+    </w:p>
+    <w:p>
+      <w:pPr>
+        <w:spacing w:line="480" w:lineRule="auto"/>
+        <w:rPr>
+          <w:rFonts w:ascii="Times New Roman" w:hAnsi="Times New Roman" w:cs="Times New Roman"/>
+        </w:rPr>
+      </w:pPr>
       <w:r>
         <w:rPr>
           <w:rFonts w:ascii="Times New Roman" w:hAnsi="Times New Roman" w:cs="Times New Roman"/>
@@ -10906,211 +10616,7 @@
           <w:i/>
           <w:iCs/>
         </w:rPr>
-        <w:t>JoinGroup(</w:t>
-      </w:r>
-      <w:proofErr w:type="gramEnd"/>
-      <w:r>
-        <w:rPr>
-          <w:rFonts w:ascii="Times New Roman" w:hAnsi="Times New Roman" w:cs="Times New Roman"/>
-          <w:b/>
-          <w:bCs/>
-          <w:i/>
-          <w:iCs/>
-        </w:rPr>
-        <w:t>)</w:t>
-      </w:r>
-      <w:r>
-        <w:rPr>
-          <w:rFonts w:ascii="Times New Roman" w:hAnsi="Times New Roman" w:cs="Times New Roman"/>
-        </w:rPr>
-        <w:t xml:space="preserve"> – Sends request to join a certain group</w:t>
-      </w:r>
-    </w:p>
-    <w:p>
-      <w:pPr>
-        <w:spacing w:line="480" w:lineRule="auto"/>
-        <w:ind w:left="720"/>
-        <w:rPr>
-          <w:rFonts w:ascii="Times New Roman" w:hAnsi="Times New Roman" w:cs="Times New Roman"/>
-        </w:rPr>
-      </w:pPr>
-      <w:r>
-        <w:rPr>
-          <w:rFonts w:ascii="Times New Roman" w:hAnsi="Times New Roman" w:cs="Times New Roman"/>
-          <w:b/>
-          <w:bCs/>
-        </w:rPr>
-        <w:t xml:space="preserve"> </w:t>
-      </w:r>
-      <w:r>
-        <w:rPr>
-          <w:rFonts w:ascii="Times New Roman" w:hAnsi="Times New Roman" w:cs="Times New Roman"/>
-          <w:b/>
-          <w:bCs/>
-        </w:rPr>
-        <w:t>Input:</w:t>
-      </w:r>
-      <w:r>
-        <w:rPr>
-          <w:rFonts w:ascii="Times New Roman" w:hAnsi="Times New Roman" w:cs="Times New Roman"/>
-          <w:b/>
-          <w:bCs/>
-        </w:rPr>
-        <w:t xml:space="preserve"> </w:t>
-      </w:r>
-      <w:r>
-        <w:rPr>
-          <w:rFonts w:ascii="Times New Roman" w:hAnsi="Times New Roman" w:cs="Times New Roman"/>
-        </w:rPr>
-        <w:t>User presses button to request to join a group, along with optional reason why they would like to join</w:t>
-      </w:r>
-    </w:p>
-    <w:p>
-      <w:pPr>
-        <w:spacing w:line="480" w:lineRule="auto"/>
-        <w:ind w:left="720"/>
-        <w:rPr>
-          <w:rFonts w:ascii="Times New Roman" w:hAnsi="Times New Roman" w:cs="Times New Roman"/>
-        </w:rPr>
-      </w:pPr>
-      <w:r>
-        <w:rPr>
-          <w:rFonts w:ascii="Times New Roman" w:hAnsi="Times New Roman" w:cs="Times New Roman"/>
-          <w:b/>
-          <w:bCs/>
-        </w:rPr>
-        <w:t xml:space="preserve"> </w:t>
-      </w:r>
-      <w:r>
-        <w:rPr>
-          <w:rFonts w:ascii="Times New Roman" w:hAnsi="Times New Roman" w:cs="Times New Roman"/>
-          <w:b/>
-          <w:bCs/>
-        </w:rPr>
-        <w:t>Output:</w:t>
-      </w:r>
-      <w:r>
-        <w:rPr>
-          <w:rFonts w:ascii="Times New Roman" w:hAnsi="Times New Roman" w:cs="Times New Roman"/>
-          <w:b/>
-          <w:bCs/>
-        </w:rPr>
-        <w:t xml:space="preserve"> </w:t>
-      </w:r>
-      <w:r>
-        <w:rPr>
-          <w:rFonts w:ascii="Times New Roman" w:hAnsi="Times New Roman" w:cs="Times New Roman"/>
-        </w:rPr>
-        <w:t>A message saying the request was successfully sent will be displayed to the user</w:t>
-      </w:r>
-    </w:p>
-    <w:p>
-      <w:pPr>
-        <w:spacing w:line="480" w:lineRule="auto"/>
-        <w:ind w:left="720"/>
-        <w:rPr>
-          <w:rFonts w:ascii="Times New Roman" w:hAnsi="Times New Roman" w:cs="Times New Roman"/>
-        </w:rPr>
-      </w:pPr>
-      <w:r>
-        <w:rPr>
-          <w:rFonts w:ascii="Times New Roman" w:hAnsi="Times New Roman" w:cs="Times New Roman"/>
-          <w:b/>
-          <w:bCs/>
-        </w:rPr>
-        <w:lastRenderedPageBreak/>
-        <w:t xml:space="preserve"> </w:t>
-      </w:r>
-      <w:r>
-        <w:rPr>
-          <w:rFonts w:ascii="Times New Roman" w:hAnsi="Times New Roman" w:cs="Times New Roman"/>
-          <w:b/>
-          <w:bCs/>
-        </w:rPr>
-        <w:t>Return Parameters:</w:t>
-      </w:r>
-      <w:r>
-        <w:rPr>
-          <w:rFonts w:ascii="Times New Roman" w:hAnsi="Times New Roman" w:cs="Times New Roman"/>
-          <w:b/>
-          <w:bCs/>
-        </w:rPr>
-        <w:t xml:space="preserve"> </w:t>
-      </w:r>
-      <w:r>
-        <w:rPr>
-          <w:rFonts w:ascii="Times New Roman" w:hAnsi="Times New Roman" w:cs="Times New Roman"/>
-        </w:rPr>
-        <w:t>Values returned by this function will be messages due to error checking, which in this case could be an error in sending the request to the proper administrator of the group</w:t>
-      </w:r>
-    </w:p>
-    <w:p>
-      <w:pPr>
-        <w:spacing w:line="480" w:lineRule="auto"/>
-        <w:ind w:firstLine="720"/>
-        <w:rPr>
-          <w:rFonts w:ascii="Times New Roman" w:hAnsi="Times New Roman" w:cs="Times New Roman"/>
-        </w:rPr>
-      </w:pPr>
-      <w:r>
-        <w:rPr>
-          <w:rFonts w:ascii="Times New Roman" w:hAnsi="Times New Roman" w:cs="Times New Roman"/>
-          <w:b/>
-          <w:bCs/>
-        </w:rPr>
-        <w:t xml:space="preserve"> </w:t>
-      </w:r>
-      <w:r>
-        <w:rPr>
-          <w:rFonts w:ascii="Times New Roman" w:hAnsi="Times New Roman" w:cs="Times New Roman"/>
-          <w:b/>
-          <w:bCs/>
-        </w:rPr>
-        <w:t>Type:</w:t>
-      </w:r>
-      <w:r>
-        <w:rPr>
-          <w:rFonts w:ascii="Times New Roman" w:hAnsi="Times New Roman" w:cs="Times New Roman"/>
-          <w:b/>
-          <w:bCs/>
-        </w:rPr>
-        <w:t xml:space="preserve"> </w:t>
-      </w:r>
-      <w:r>
-        <w:rPr>
-          <w:rFonts w:ascii="Times New Roman" w:hAnsi="Times New Roman" w:cs="Times New Roman"/>
-        </w:rPr>
-        <w:t>Optional reason to join the group is a string, request is a button</w:t>
-      </w:r>
-    </w:p>
-    <w:p>
-      <w:pPr>
-        <w:spacing w:line="480" w:lineRule="auto"/>
-        <w:rPr>
-          <w:rFonts w:ascii="Times New Roman" w:hAnsi="Times New Roman" w:cs="Times New Roman"/>
-        </w:rPr>
-      </w:pPr>
-      <w:proofErr w:type="gramStart"/>
-      <w:r>
-        <w:rPr>
-          <w:rFonts w:ascii="Times New Roman" w:hAnsi="Times New Roman" w:cs="Times New Roman"/>
-          <w:b/>
-          <w:bCs/>
-          <w:i/>
-          <w:iCs/>
-        </w:rPr>
-        <w:t>ViewActivities(</w:t>
-      </w:r>
-      <w:proofErr w:type="gramEnd"/>
-      <w:r>
-        <w:rPr>
-          <w:rFonts w:ascii="Times New Roman" w:hAnsi="Times New Roman" w:cs="Times New Roman"/>
-          <w:b/>
-          <w:bCs/>
-          <w:i/>
-          <w:iCs/>
-        </w:rPr>
-        <w:t>)</w:t>
+        <w:t>ViewActivities()</w:t>
       </w:r>
       <w:r>
         <w:rPr>
@@ -12579,19 +12085,11 @@
         </w:rPr>
         <w:t xml:space="preserve">brief </w:t>
       </w:r>
-      <w:proofErr w:type="gramStart"/>
-      <w:r>
-        <w:rPr>
-          <w:rFonts w:ascii="Times New Roman" w:hAnsi="Times New Roman" w:cs="Times New Roman"/>
-        </w:rPr>
-        <w:t>guideline</w:t>
-      </w:r>
-      <w:proofErr w:type="gramEnd"/>
-      <w:r>
-        <w:rPr>
-          <w:rFonts w:ascii="Times New Roman" w:hAnsi="Times New Roman" w:cs="Times New Roman"/>
-        </w:rPr>
-        <w:t xml:space="preserve"> </w:t>
+      <w:r>
+        <w:rPr>
+          <w:rFonts w:ascii="Times New Roman" w:hAnsi="Times New Roman" w:cs="Times New Roman"/>
+        </w:rPr>
+        <w:t xml:space="preserve">guideline </w:t>
       </w:r>
       <w:r>
         <w:rPr>
@@ -12828,19 +12326,11 @@
           <w:iCs/>
         </w:rPr>
       </w:pPr>
-      <w:proofErr w:type="gramStart"/>
-      <w:r>
-        <w:rPr>
-          <w:rFonts w:ascii="Times New Roman" w:hAnsi="Times New Roman" w:cs="Times New Roman"/>
-        </w:rPr>
-        <w:t>student</w:t>
-      </w:r>
-      <w:proofErr w:type="gramEnd"/>
-      <w:r>
-        <w:rPr>
-          <w:rFonts w:ascii="Times New Roman" w:hAnsi="Times New Roman" w:cs="Times New Roman"/>
-        </w:rPr>
-        <w:t xml:space="preserve"> can make changes to profile</w:t>
+      <w:r>
+        <w:rPr>
+          <w:rFonts w:ascii="Times New Roman" w:hAnsi="Times New Roman" w:cs="Times New Roman"/>
+        </w:rPr>
+        <w:t>student can make changes to profile</w:t>
       </w:r>
       <w:r>
         <w:rPr>
@@ -12896,44 +12386,8 @@
         <w:rPr>
           <w:rFonts w:ascii="Times New Roman" w:hAnsi="Times New Roman" w:cs="Times New Roman"/>
         </w:rPr>
-        <w:t xml:space="preserve"> </w:t>
-      </w:r>
-      <w:proofErr w:type="gramStart"/>
-      <w:r>
-        <w:rPr>
-          <w:rFonts w:ascii="Times New Roman" w:hAnsi="Times New Roman" w:cs="Times New Roman"/>
-        </w:rPr>
-        <w:t>student</w:t>
-      </w:r>
-      <w:proofErr w:type="gramEnd"/>
-      <w:r>
-        <w:rPr>
-          <w:rFonts w:ascii="Times New Roman" w:hAnsi="Times New Roman" w:cs="Times New Roman"/>
-        </w:rPr>
-        <w:t xml:space="preserve"> can log </w:t>
-      </w:r>
-      <w:proofErr w:type="gramStart"/>
-      <w:r>
-        <w:rPr>
-          <w:rFonts w:ascii="Times New Roman" w:hAnsi="Times New Roman" w:cs="Times New Roman"/>
-        </w:rPr>
-        <w:t>a fitness</w:t>
-      </w:r>
-      <w:proofErr w:type="gramEnd"/>
-      <w:r>
-        <w:rPr>
-          <w:rFonts w:ascii="Times New Roman" w:hAnsi="Times New Roman" w:cs="Times New Roman"/>
-        </w:rPr>
-        <w:t xml:space="preserve"> </w:t>
-      </w:r>
-      <w:proofErr w:type="gramStart"/>
-      <w:r>
-        <w:rPr>
-          <w:rFonts w:ascii="Times New Roman" w:hAnsi="Times New Roman" w:cs="Times New Roman"/>
-        </w:rPr>
-        <w:t>activity</w:t>
-      </w:r>
-      <w:proofErr w:type="gramEnd"/>
+        <w:t xml:space="preserve"> student can log a fitness activity</w:t>
+      </w:r>
       <w:r>
         <w:rPr>
           <w:rFonts w:ascii="Times New Roman" w:hAnsi="Times New Roman" w:cs="Times New Roman"/>
@@ -12944,16 +12398,8 @@
         <w:rPr>
           <w:rFonts w:ascii="Times New Roman" w:hAnsi="Times New Roman" w:cs="Times New Roman"/>
         </w:rPr>
-        <w:t xml:space="preserve">view past </w:t>
-      </w:r>
-      <w:proofErr w:type="gramStart"/>
-      <w:r>
-        <w:rPr>
-          <w:rFonts w:ascii="Times New Roman" w:hAnsi="Times New Roman" w:cs="Times New Roman"/>
-        </w:rPr>
-        <w:t>activity</w:t>
-      </w:r>
-      <w:proofErr w:type="gramEnd"/>
+        <w:t>view past activity</w:t>
+      </w:r>
     </w:p>
     <w:p>
       <w:pPr>
@@ -13109,19 +12555,11 @@
           <w:iCs/>
         </w:rPr>
       </w:pPr>
-      <w:proofErr w:type="gramStart"/>
-      <w:r>
-        <w:rPr>
-          <w:rFonts w:ascii="Times New Roman" w:hAnsi="Times New Roman" w:cs="Times New Roman"/>
-        </w:rPr>
-        <w:t>student</w:t>
-      </w:r>
-      <w:proofErr w:type="gramEnd"/>
-      <w:r>
-        <w:rPr>
-          <w:rFonts w:ascii="Times New Roman" w:hAnsi="Times New Roman" w:cs="Times New Roman"/>
-        </w:rPr>
-        <w:t xml:space="preserve"> can participate in group </w:t>
+      <w:r>
+        <w:rPr>
+          <w:rFonts w:ascii="Times New Roman" w:hAnsi="Times New Roman" w:cs="Times New Roman"/>
+        </w:rPr>
+        <w:t xml:space="preserve">student can participate in group </w:t>
       </w:r>
       <w:r>
         <w:rPr>
@@ -13139,16 +12577,8 @@
         <w:rPr>
           <w:rFonts w:ascii="Times New Roman" w:hAnsi="Times New Roman" w:cs="Times New Roman"/>
         </w:rPr>
-        <w:t xml:space="preserve">by logging activities performed in group </w:t>
-      </w:r>
-      <w:proofErr w:type="gramStart"/>
-      <w:r>
-        <w:rPr>
-          <w:rFonts w:ascii="Times New Roman" w:hAnsi="Times New Roman" w:cs="Times New Roman"/>
-        </w:rPr>
-        <w:t>setting</w:t>
-      </w:r>
-      <w:proofErr w:type="gramEnd"/>
+        <w:t>by logging activities performed in group setting</w:t>
+      </w:r>
     </w:p>
     <w:p>
       <w:pPr>
@@ -14955,7 +14385,6 @@
         </w:rPr>
         <w:t>IBM. (2025, Feb 14</w:t>
       </w:r>
-      <w:proofErr w:type="gramStart"/>
       <w:r>
         <w:rPr>
           <w:rFonts w:ascii="Times New Roman" w:hAnsi="Times New Roman" w:cs="Times New Roman"/>
@@ -14969,15 +14398,7 @@
           <w:rFonts w:ascii="Times New Roman" w:hAnsi="Times New Roman" w:cs="Times New Roman"/>
           <w:color w:val="000000" w:themeColor="text1"/>
         </w:rPr>
-        <w:t xml:space="preserve"> )</w:t>
-      </w:r>
-      <w:proofErr w:type="gramEnd"/>
-      <w:r>
-        <w:rPr>
-          <w:rFonts w:ascii="Times New Roman" w:hAnsi="Times New Roman" w:cs="Times New Roman"/>
-          <w:color w:val="000000" w:themeColor="text1"/>
-        </w:rPr>
-        <w:t xml:space="preserve">. </w:t>
+        <w:t xml:space="preserve"> ). </w:t>
       </w:r>
       <w:r>
         <w:rPr>
@@ -16050,15 +15471,7 @@
           <w:rFonts w:ascii="Times New Roman" w:hAnsi="Times New Roman" w:cs="Times New Roman"/>
           <w:color w:val="000000" w:themeColor="text1"/>
         </w:rPr>
-        <w:t xml:space="preserve">Data </w:t>
-      </w:r>
-      <w:proofErr w:type="gramStart"/>
-      <w:r>
-        <w:rPr>
-          <w:rFonts w:ascii="Times New Roman" w:hAnsi="Times New Roman" w:cs="Times New Roman"/>
-          <w:color w:val="000000" w:themeColor="text1"/>
-        </w:rPr>
-        <w:t>Flow</w:t>
+        <w:t>Data Flow</w:t>
       </w:r>
       <w:r>
         <w:rPr>
@@ -16086,15 +15499,7 @@
           <w:rFonts w:ascii="Times New Roman" w:hAnsi="Times New Roman" w:cs="Times New Roman"/>
           <w:color w:val="000000" w:themeColor="text1"/>
         </w:rPr>
-        <w:t>le</w:t>
-      </w:r>
-      <w:proofErr w:type="gramEnd"/>
-      <w:r>
-        <w:rPr>
-          <w:rFonts w:ascii="Times New Roman" w:hAnsi="Times New Roman" w:cs="Times New Roman"/>
-          <w:color w:val="000000" w:themeColor="text1"/>
-        </w:rPr>
-        <w:t xml:space="preserve"> Cohesion</w:t>
+        <w:t>le Cohesion</w:t>
       </w:r>
       <w:r>
         <w:rPr>
@@ -16442,23 +15847,7 @@
           <w:rFonts w:ascii="Times New Roman" w:hAnsi="Times New Roman" w:cs="Times New Roman"/>
           <w:color w:val="000000" w:themeColor="text1"/>
         </w:rPr>
-        <w:t xml:space="preserve">I, John </w:t>
-      </w:r>
-      <w:proofErr w:type="gramStart"/>
-      <w:r>
-        <w:rPr>
-          <w:rFonts w:ascii="Times New Roman" w:hAnsi="Times New Roman" w:cs="Times New Roman"/>
-          <w:color w:val="000000" w:themeColor="text1"/>
-        </w:rPr>
-        <w:t>Gerega</w:t>
-      </w:r>
-      <w:proofErr w:type="gramEnd"/>
-      <w:r>
-        <w:rPr>
-          <w:rFonts w:ascii="Times New Roman" w:hAnsi="Times New Roman" w:cs="Times New Roman"/>
-          <w:color w:val="000000" w:themeColor="text1"/>
-        </w:rPr>
-        <w:t xml:space="preserve"> confirm that all work I have contributed to this document has been to the best of my knowledge completed with integrity and in accordance with the objectives and collaborative standards established by the team. I </w:t>
+        <w:t xml:space="preserve">I, John Gerega confirm that all work I have contributed to this document has been to the best of my knowledge completed with integrity and in accordance with the objectives and collaborative standards established by the team. I </w:t>
       </w:r>
       <w:proofErr w:type="gramStart"/>
       <w:r>

</xml_diff>